<commit_message>
El Formador de una OPI firma una sola vez, se reutiliza para todas las actas de formacion que se generan, se incluye firma en el acta. descarga programada de la matriz una vez al mes
</commit_message>
<xml_diff>
--- a/media/plantillas/acta_formacion.docx
+++ b/media/plantillas/acta_formacion.docx
@@ -4,7 +4,7 @@
   <w:body>
     <w:tbl>
       <w:tblPr>
-        <w:tblW w:w="9687" w:type="dxa"/>
+        <w:tblW w:w="9697" w:type="dxa"/>
         <w:jc w:val="center"/>
         <w:tblLayout w:type="fixed"/>
         <w:tblCellMar>
@@ -14,10 +14,10 @@
         <w:tblLook w:val="0000" w:firstRow="0" w:lastRow="0" w:firstColumn="0" w:lastColumn="0" w:noHBand="0" w:noVBand="0"/>
       </w:tblPr>
       <w:tblGrid>
-        <w:gridCol w:w="2954"/>
-        <w:gridCol w:w="2977"/>
-        <w:gridCol w:w="425"/>
-        <w:gridCol w:w="3331"/>
+        <w:gridCol w:w="3050"/>
+        <w:gridCol w:w="2890"/>
+        <w:gridCol w:w="420"/>
+        <w:gridCol w:w="3337"/>
       </w:tblGrid>
       <w:tr>
         <w:trPr>
@@ -25,13 +25,13 @@
         </w:trPr>
         <w:tc>
           <w:tcPr>
-            <w:tcW w:w="9687" w:type="dxa"/>
+            <w:tcW w:w="9697" w:type="dxa"/>
             <w:gridSpan w:val="4"/>
             <w:tcBorders>
-              <w:top w:val="single" w:sz="18" w:space="0" w:color="auto"/>
-              <w:left w:val="single" w:sz="18" w:space="0" w:color="auto"/>
-              <w:bottom w:val="single" w:sz="18" w:space="0" w:color="auto"/>
-              <w:right w:val="single" w:sz="18" w:space="0" w:color="auto"/>
+              <w:top w:val="single" w:sz="18" w:space="0" w:color="000000"/>
+              <w:left w:val="single" w:sz="18" w:space="0" w:color="000000"/>
+              <w:bottom w:val="single" w:sz="18" w:space="0" w:color="000000"/>
+              <w:right w:val="single" w:sz="18" w:space="0" w:color="000000"/>
             </w:tcBorders>
             <w:shd w:val="clear" w:color="auto" w:fill="FFFFFF" w:themeFill="background1"/>
           </w:tcPr>
@@ -72,11 +72,11 @@
         </w:trPr>
         <w:tc>
           <w:tcPr>
-            <w:tcW w:w="2954" w:type="dxa"/>
+            <w:tcW w:w="3050" w:type="dxa"/>
             <w:tcBorders>
-              <w:left w:val="single" w:sz="18" w:space="0" w:color="auto"/>
-              <w:bottom w:val="single" w:sz="6" w:space="0" w:color="auto"/>
-              <w:right w:val="single" w:sz="6" w:space="0" w:color="auto"/>
+              <w:left w:val="single" w:sz="18" w:space="0" w:color="000000"/>
+              <w:bottom w:val="single" w:sz="6" w:space="0" w:color="000000"/>
+              <w:right w:val="single" w:sz="6" w:space="0" w:color="000000"/>
             </w:tcBorders>
           </w:tcPr>
           <w:p>
@@ -94,45 +94,23 @@
                 <w:lang w:val="es-ES" w:eastAsia="de-CH" w:bidi="ar-SA"/>
               </w:rPr>
             </w:pPr>
+            <w:proofErr w:type="gramStart"/>
             <w:r>
               <w:rPr>
                 <w:rFonts w:eastAsia="Times New Roman" w:cs="Times New Roman"/>
                 <w:b/>
-                <w:sz w:val="28"/>
-                <w:szCs w:val="20"/>
-                <w:lang w:val="es-ES" w:eastAsia="de-CH" w:bidi="ar-SA"/>
-              </w:rPr>
-              <w:t>FECHA</w:t>
-            </w:r>
-            <w:r>
-              <w:rPr>
-                <w:rFonts w:eastAsia="Times New Roman" w:cs="Times New Roman"/>
-                <w:b/>
-                <w:sz w:val="28"/>
-                <w:szCs w:val="20"/>
-                <w:lang w:val="es-ES" w:eastAsia="de-CH" w:bidi="ar-SA"/>
-              </w:rPr>
-              <w:t>:</w:t>
-            </w:r>
-            <w:r>
-              <w:rPr>
-                <w:rFonts w:eastAsia="Times New Roman" w:cs="Times New Roman"/>
-                <w:b/>
-                <w:sz w:val="28"/>
-                <w:szCs w:val="20"/>
-                <w:lang w:val="es-ES" w:eastAsia="de-CH" w:bidi="ar-SA"/>
-              </w:rPr>
-              <w:t xml:space="preserve"> </w:t>
-            </w:r>
-            <w:proofErr w:type="gramStart"/>
-            <w:r>
-              <w:rPr>
-                <w:rFonts w:eastAsia="Times New Roman" w:cs="Times New Roman"/>
-                <w:bCs/>
                 <w:sz w:val="24"/>
                 <w:szCs w:val="24"/>
                 <w:lang w:val="es-ES" w:eastAsia="de-CH" w:bidi="ar-SA"/>
               </w:rPr>
+              <w:t>FECHA:</w:t>
+            </w:r>
+            <w:r>
+              <w:rPr>
+                <w:rFonts w:eastAsia="Times New Roman" w:cs="Times New Roman"/>
+                <w:bCs/>
+                <w:lang w:val="es-ES" w:eastAsia="de-CH" w:bidi="ar-SA"/>
+              </w:rPr>
               <w:t>{{ fecha</w:t>
             </w:r>
             <w:proofErr w:type="gramEnd"/>
@@ -140,8 +118,6 @@
               <w:rPr>
                 <w:rFonts w:eastAsia="Times New Roman" w:cs="Times New Roman"/>
                 <w:bCs/>
-                <w:sz w:val="24"/>
-                <w:szCs w:val="24"/>
                 <w:lang w:val="es-ES" w:eastAsia="de-CH" w:bidi="ar-SA"/>
               </w:rPr>
               <w:t xml:space="preserve"> }}</w:t>
@@ -150,12 +126,12 @@
         </w:tc>
         <w:tc>
           <w:tcPr>
-            <w:tcW w:w="6733" w:type="dxa"/>
+            <w:tcW w:w="6647" w:type="dxa"/>
             <w:gridSpan w:val="3"/>
             <w:tcBorders>
-              <w:left w:val="single" w:sz="6" w:space="0" w:color="auto"/>
-              <w:bottom w:val="single" w:sz="6" w:space="0" w:color="auto"/>
-              <w:right w:val="single" w:sz="18" w:space="0" w:color="auto"/>
+              <w:left w:val="single" w:sz="6" w:space="0" w:color="000000"/>
+              <w:bottom w:val="single" w:sz="6" w:space="0" w:color="000000"/>
+              <w:right w:val="single" w:sz="18" w:space="0" w:color="000000"/>
             </w:tcBorders>
           </w:tcPr>
           <w:p>
@@ -202,17 +178,7 @@
                 <w:szCs w:val="20"/>
                 <w:lang w:val="es-ES" w:eastAsia="de-CH" w:bidi="ar-SA"/>
               </w:rPr>
-              <w:t xml:space="preserve"> </w:t>
-            </w:r>
-            <w:r>
-              <w:rPr>
-                <w:rFonts w:eastAsia="Times New Roman" w:cs="Times New Roman"/>
-                <w:bCs/>
-                <w:sz w:val="28"/>
-                <w:szCs w:val="20"/>
-                <w:lang w:val="es-ES" w:eastAsia="de-CH" w:bidi="ar-SA"/>
-              </w:rPr>
-              <w:t xml:space="preserve"> {{ puesto</w:t>
+              <w:t xml:space="preserve">  {{ puesto</w:t>
             </w:r>
             <w:proofErr w:type="gramEnd"/>
             <w:r>
@@ -234,12 +200,12 @@
         </w:trPr>
         <w:tc>
           <w:tcPr>
-            <w:tcW w:w="5931" w:type="dxa"/>
+            <w:tcW w:w="5940" w:type="dxa"/>
             <w:gridSpan w:val="2"/>
             <w:tcBorders>
-              <w:left w:val="single" w:sz="18" w:space="0" w:color="auto"/>
-              <w:bottom w:val="single" w:sz="6" w:space="0" w:color="auto"/>
-              <w:right w:val="single" w:sz="6" w:space="0" w:color="auto"/>
+              <w:left w:val="single" w:sz="18" w:space="0" w:color="000000"/>
+              <w:bottom w:val="single" w:sz="6" w:space="0" w:color="000000"/>
+              <w:right w:val="single" w:sz="6" w:space="0" w:color="000000"/>
             </w:tcBorders>
           </w:tcPr>
           <w:p>
@@ -263,8 +229,9 @@
                 <w:szCs w:val="20"/>
                 <w:lang w:val="es-ES" w:eastAsia="de-CH" w:bidi="ar-SA"/>
               </w:rPr>
-              <w:t>Forma</w:t>
-            </w:r>
+              <w:t>Formador</w:t>
+            </w:r>
+            <w:proofErr w:type="gramStart"/>
             <w:r>
               <w:rPr>
                 <w:rFonts w:eastAsia="Times New Roman" w:cs="Times New Roman"/>
@@ -273,17 +240,6 @@
                 <w:szCs w:val="20"/>
                 <w:lang w:val="es-ES" w:eastAsia="de-CH" w:bidi="ar-SA"/>
               </w:rPr>
-              <w:t>dor</w:t>
-            </w:r>
-            <w:proofErr w:type="gramStart"/>
-            <w:r>
-              <w:rPr>
-                <w:rFonts w:eastAsia="Times New Roman" w:cs="Times New Roman"/>
-                <w:b/>
-                <w:sz w:val="28"/>
-                <w:szCs w:val="20"/>
-                <w:lang w:val="es-ES" w:eastAsia="de-CH" w:bidi="ar-SA"/>
-              </w:rPr>
               <w:t>:</w:t>
             </w:r>
             <w:r>
@@ -294,25 +250,15 @@
                 <w:szCs w:val="20"/>
                 <w:lang w:val="es-ES" w:eastAsia="de-CH" w:bidi="ar-SA"/>
               </w:rPr>
-              <w:t xml:space="preserve"> </w:t>
+              <w:t xml:space="preserve">  </w:t>
             </w:r>
             <w:r>
               <w:rPr>
                 <w:rFonts w:eastAsia="Times New Roman" w:cs="Times New Roman"/>
                 <w:bCs/>
-                <w:sz w:val="28"/>
-                <w:szCs w:val="20"/>
-                <w:lang w:val="es-ES" w:eastAsia="de-CH" w:bidi="ar-SA"/>
-              </w:rPr>
-              <w:t xml:space="preserve"> </w:t>
-            </w:r>
-            <w:r>
-              <w:rPr>
-                <w:rFonts w:eastAsia="Times New Roman" w:cs="Times New Roman"/>
-                <w:bCs/>
-                <w:lang w:val="es-ES" w:eastAsia="de-CH" w:bidi="ar-SA"/>
-              </w:rPr>
-              <w:t>{{ supervisor</w:t>
+                <w:lang w:val="es-ES" w:eastAsia="de-CH" w:bidi="ar-SA"/>
+              </w:rPr>
+              <w:t>{{ formador</w:t>
             </w:r>
             <w:proofErr w:type="gramEnd"/>
             <w:r>
@@ -327,12 +273,12 @@
         </w:tc>
         <w:tc>
           <w:tcPr>
-            <w:tcW w:w="3756" w:type="dxa"/>
+            <w:tcW w:w="3757" w:type="dxa"/>
             <w:gridSpan w:val="2"/>
             <w:tcBorders>
-              <w:left w:val="single" w:sz="6" w:space="0" w:color="auto"/>
-              <w:bottom w:val="single" w:sz="6" w:space="0" w:color="auto"/>
-              <w:right w:val="single" w:sz="18" w:space="0" w:color="auto"/>
+              <w:left w:val="single" w:sz="6" w:space="0" w:color="000000"/>
+              <w:bottom w:val="single" w:sz="6" w:space="0" w:color="000000"/>
+              <w:right w:val="single" w:sz="18" w:space="0" w:color="000000"/>
             </w:tcBorders>
           </w:tcPr>
           <w:p>
@@ -379,7 +325,7 @@
                 <w:szCs w:val="20"/>
                 <w:lang w:val="es-ES" w:eastAsia="de-CH" w:bidi="ar-SA"/>
               </w:rPr>
-              <w:t xml:space="preserve"> </w:t>
+              <w:t xml:space="preserve">  {{ </w:t>
             </w:r>
             <w:r>
               <w:rPr>
@@ -389,8 +335,9 @@
                 <w:szCs w:val="20"/>
                 <w:lang w:val="es-ES" w:eastAsia="de-CH" w:bidi="ar-SA"/>
               </w:rPr>
-              <w:t xml:space="preserve"> </w:t>
-            </w:r>
+              <w:t>tiempo</w:t>
+            </w:r>
+            <w:proofErr w:type="gramEnd"/>
             <w:r>
               <w:rPr>
                 <w:rFonts w:eastAsia="Times New Roman" w:cs="Times New Roman"/>
@@ -399,48 +346,7 @@
                 <w:szCs w:val="20"/>
                 <w:lang w:val="es-ES" w:eastAsia="de-CH" w:bidi="ar-SA"/>
               </w:rPr>
-              <w:t>{{</w:t>
-            </w:r>
-            <w:r>
-              <w:rPr>
-                <w:rFonts w:eastAsia="Times New Roman" w:cs="Times New Roman"/>
-                <w:bCs/>
-                <w:sz w:val="28"/>
-                <w:szCs w:val="20"/>
-                <w:lang w:val="es-ES" w:eastAsia="de-CH" w:bidi="ar-SA"/>
-              </w:rPr>
-              <w:t xml:space="preserve"> </w:t>
-            </w:r>
-            <w:r>
-              <w:rPr>
-                <w:rFonts w:eastAsia="Times New Roman" w:cs="Times New Roman"/>
-                <w:bCs/>
-                <w:sz w:val="28"/>
-                <w:szCs w:val="20"/>
-                <w:lang w:val="es-ES" w:eastAsia="de-CH" w:bidi="ar-SA"/>
-              </w:rPr>
-              <w:t>hora</w:t>
-            </w:r>
-            <w:proofErr w:type="gramEnd"/>
-            <w:r>
-              <w:rPr>
-                <w:rFonts w:eastAsia="Times New Roman" w:cs="Times New Roman"/>
-                <w:bCs/>
-                <w:sz w:val="28"/>
-                <w:szCs w:val="20"/>
-                <w:lang w:val="es-ES" w:eastAsia="de-CH" w:bidi="ar-SA"/>
-              </w:rPr>
-              <w:t xml:space="preserve"> </w:t>
-            </w:r>
-            <w:r>
-              <w:rPr>
-                <w:rFonts w:eastAsia="Times New Roman" w:cs="Times New Roman"/>
-                <w:bCs/>
-                <w:sz w:val="28"/>
-                <w:szCs w:val="20"/>
-                <w:lang w:val="es-ES" w:eastAsia="de-CH" w:bidi="ar-SA"/>
-              </w:rPr>
-              <w:t>}}</w:t>
+              <w:t xml:space="preserve"> }}</w:t>
             </w:r>
           </w:p>
         </w:tc>
@@ -451,11 +357,11 @@
         </w:trPr>
         <w:tc>
           <w:tcPr>
-            <w:tcW w:w="9687" w:type="dxa"/>
+            <w:tcW w:w="9697" w:type="dxa"/>
             <w:gridSpan w:val="4"/>
             <w:tcBorders>
-              <w:left w:val="single" w:sz="18" w:space="0" w:color="auto"/>
-              <w:right w:val="single" w:sz="18" w:space="0" w:color="auto"/>
+              <w:left w:val="single" w:sz="18" w:space="0" w:color="000000"/>
+              <w:right w:val="single" w:sz="18" w:space="0" w:color="000000"/>
             </w:tcBorders>
           </w:tcPr>
           <w:p>
@@ -479,17 +385,7 @@
                 <w:szCs w:val="20"/>
                 <w:lang w:val="es-ES" w:eastAsia="de-CH" w:bidi="ar-SA"/>
               </w:rPr>
-              <w:t>CONTENIDO CURSO:</w:t>
-            </w:r>
-            <w:r>
-              <w:rPr>
-                <w:rFonts w:eastAsia="Times New Roman" w:cs="Times New Roman"/>
-                <w:b/>
-                <w:sz w:val="28"/>
-                <w:szCs w:val="20"/>
-                <w:lang w:val="es-ES" w:eastAsia="de-CH" w:bidi="ar-SA"/>
-              </w:rPr>
-              <w:t xml:space="preserve"> </w:t>
+              <w:t xml:space="preserve">CONTENIDO CURSO: </w:t>
             </w:r>
             <w:r>
               <w:rPr>
@@ -577,11 +473,11 @@
         </w:trPr>
         <w:tc>
           <w:tcPr>
-            <w:tcW w:w="9687" w:type="dxa"/>
+            <w:tcW w:w="9697" w:type="dxa"/>
             <w:gridSpan w:val="4"/>
             <w:tcBorders>
-              <w:left w:val="single" w:sz="18" w:space="0" w:color="auto"/>
-              <w:right w:val="single" w:sz="18" w:space="0" w:color="auto"/>
+              <w:left w:val="single" w:sz="18" w:space="0" w:color="000000"/>
+              <w:right w:val="single" w:sz="18" w:space="0" w:color="000000"/>
             </w:tcBorders>
           </w:tcPr>
           <w:p>
@@ -607,13 +503,13 @@
         </w:trPr>
         <w:tc>
           <w:tcPr>
-            <w:tcW w:w="6356" w:type="dxa"/>
+            <w:tcW w:w="6360" w:type="dxa"/>
             <w:gridSpan w:val="3"/>
             <w:tcBorders>
-              <w:top w:val="single" w:sz="6" w:space="0" w:color="auto"/>
-              <w:left w:val="single" w:sz="18" w:space="0" w:color="auto"/>
-              <w:bottom w:val="single" w:sz="6" w:space="0" w:color="auto"/>
-              <w:right w:val="single" w:sz="6" w:space="0" w:color="auto"/>
+              <w:top w:val="single" w:sz="6" w:space="0" w:color="000000"/>
+              <w:left w:val="single" w:sz="18" w:space="0" w:color="000000"/>
+              <w:bottom w:val="single" w:sz="6" w:space="0" w:color="000000"/>
+              <w:right w:val="single" w:sz="6" w:space="0" w:color="000000"/>
             </w:tcBorders>
           </w:tcPr>
           <w:p>
@@ -667,11 +563,11 @@
         </w:tc>
         <w:tc>
           <w:tcPr>
-            <w:tcW w:w="3331" w:type="dxa"/>
+            <w:tcW w:w="3337" w:type="dxa"/>
             <w:tcBorders>
-              <w:top w:val="single" w:sz="6" w:space="0" w:color="auto"/>
-              <w:left w:val="single" w:sz="6" w:space="0" w:color="auto"/>
-              <w:right w:val="single" w:sz="18" w:space="0" w:color="auto"/>
+              <w:top w:val="single" w:sz="6" w:space="0" w:color="000000"/>
+              <w:left w:val="single" w:sz="6" w:space="0" w:color="000000"/>
+              <w:right w:val="single" w:sz="18" w:space="0" w:color="000000"/>
             </w:tcBorders>
           </w:tcPr>
           <w:p>
@@ -708,11 +604,11 @@
         </w:trPr>
         <w:tc>
           <w:tcPr>
-            <w:tcW w:w="6356" w:type="dxa"/>
+            <w:tcW w:w="6360" w:type="dxa"/>
             <w:gridSpan w:val="3"/>
             <w:tcBorders>
-              <w:left w:val="single" w:sz="18" w:space="0" w:color="auto"/>
-              <w:right w:val="single" w:sz="6" w:space="0" w:color="auto"/>
+              <w:left w:val="single" w:sz="18" w:space="0" w:color="000000"/>
+              <w:right w:val="single" w:sz="6" w:space="0" w:color="000000"/>
             </w:tcBorders>
           </w:tcPr>
           <w:p>
@@ -795,11 +691,11 @@
         </w:tc>
         <w:tc>
           <w:tcPr>
-            <w:tcW w:w="3331" w:type="dxa"/>
+            <w:tcW w:w="3337" w:type="dxa"/>
             <w:tcBorders>
-              <w:top w:val="single" w:sz="6" w:space="0" w:color="auto"/>
-              <w:left w:val="single" w:sz="6" w:space="0" w:color="auto"/>
-              <w:right w:val="single" w:sz="18" w:space="0" w:color="auto"/>
+              <w:top w:val="single" w:sz="6" w:space="0" w:color="000000"/>
+              <w:left w:val="single" w:sz="6" w:space="0" w:color="000000"/>
+              <w:right w:val="single" w:sz="18" w:space="0" w:color="000000"/>
             </w:tcBorders>
           </w:tcPr>
           <w:p>
@@ -824,8 +720,9 @@
                 <w:szCs w:val="20"/>
                 <w:lang w:val="pt-PT" w:eastAsia="de-CH" w:bidi="ar-SA"/>
               </w:rPr>
-              <w:t>{{</w:t>
-            </w:r>
+              <w:t xml:space="preserve">{{ </w:t>
+            </w:r>
+            <w:proofErr w:type="spellStart"/>
             <w:r>
               <w:rPr>
                 <w:rFonts w:eastAsia="Times New Roman" w:cs="Times New Roman"/>
@@ -833,9 +730,9 @@
                 <w:szCs w:val="20"/>
                 <w:lang w:val="pt-PT" w:eastAsia="de-CH" w:bidi="ar-SA"/>
               </w:rPr>
-              <w:t xml:space="preserve"> </w:t>
-            </w:r>
-            <w:proofErr w:type="spellStart"/>
+              <w:t>firma</w:t>
+            </w:r>
+            <w:proofErr w:type="gramEnd"/>
             <w:r>
               <w:rPr>
                 <w:rFonts w:eastAsia="Times New Roman" w:cs="Times New Roman"/>
@@ -843,9 +740,9 @@
                 <w:szCs w:val="20"/>
                 <w:lang w:val="pt-PT" w:eastAsia="de-CH" w:bidi="ar-SA"/>
               </w:rPr>
-              <w:t>firma</w:t>
-            </w:r>
-            <w:proofErr w:type="gramEnd"/>
+              <w:t>_alumno</w:t>
+            </w:r>
+            <w:proofErr w:type="spellEnd"/>
             <w:r>
               <w:rPr>
                 <w:rFonts w:eastAsia="Times New Roman" w:cs="Times New Roman"/>
@@ -853,26 +750,7 @@
                 <w:szCs w:val="20"/>
                 <w:lang w:val="pt-PT" w:eastAsia="de-CH" w:bidi="ar-SA"/>
               </w:rPr>
-              <w:t>_alumno</w:t>
-            </w:r>
-            <w:proofErr w:type="spellEnd"/>
-            <w:r>
-              <w:rPr>
-                <w:rFonts w:eastAsia="Times New Roman" w:cs="Times New Roman"/>
-                <w:bCs/>
-                <w:szCs w:val="20"/>
-                <w:lang w:val="pt-PT" w:eastAsia="de-CH" w:bidi="ar-SA"/>
-              </w:rPr>
-              <w:t xml:space="preserve"> </w:t>
-            </w:r>
-            <w:r>
-              <w:rPr>
-                <w:rFonts w:eastAsia="Times New Roman" w:cs="Times New Roman"/>
-                <w:bCs/>
-                <w:szCs w:val="20"/>
-                <w:lang w:val="pt-PT" w:eastAsia="de-CH" w:bidi="ar-SA"/>
-              </w:rPr>
-              <w:t>}}</w:t>
+              <w:t xml:space="preserve"> }}</w:t>
             </w:r>
           </w:p>
         </w:tc>
@@ -883,12 +761,12 @@
         </w:trPr>
         <w:tc>
           <w:tcPr>
-            <w:tcW w:w="9687" w:type="dxa"/>
+            <w:tcW w:w="9697" w:type="dxa"/>
             <w:gridSpan w:val="4"/>
             <w:tcBorders>
-              <w:top w:val="single" w:sz="4" w:space="0" w:color="auto"/>
-              <w:left w:val="single" w:sz="18" w:space="0" w:color="auto"/>
-              <w:right w:val="single" w:sz="18" w:space="0" w:color="auto"/>
+              <w:top w:val="single" w:sz="4" w:space="0" w:color="000000"/>
+              <w:left w:val="single" w:sz="18" w:space="0" w:color="000000"/>
+              <w:right w:val="single" w:sz="18" w:space="0" w:color="000000"/>
             </w:tcBorders>
           </w:tcPr>
           <w:p>
@@ -911,7 +789,7 @@
                 <w:szCs w:val="20"/>
                 <w:lang w:val="es-ES" w:eastAsia="de-CH" w:bidi="ar-SA"/>
               </w:rPr>
-              <w:t>Observaciones generales:</w:t>
+              <w:t xml:space="preserve">Observaciones generales:                                                                  </w:t>
             </w:r>
           </w:p>
         </w:tc>
@@ -922,11 +800,68 @@
         </w:trPr>
         <w:tc>
           <w:tcPr>
-            <w:tcW w:w="9687" w:type="dxa"/>
+            <w:tcW w:w="9697" w:type="dxa"/>
             <w:gridSpan w:val="4"/>
             <w:tcBorders>
-              <w:left w:val="single" w:sz="18" w:space="0" w:color="auto"/>
-              <w:right w:val="single" w:sz="18" w:space="0" w:color="auto"/>
+              <w:left w:val="single" w:sz="18" w:space="0" w:color="000000"/>
+              <w:right w:val="single" w:sz="18" w:space="0" w:color="000000"/>
+            </w:tcBorders>
+          </w:tcPr>
+          <w:p>
+            <w:pPr>
+              <w:tabs>
+                <w:tab w:val="left" w:pos="993"/>
+              </w:tabs>
+              <w:spacing w:before="120" w:after="0" w:line="240" w:lineRule="auto"/>
+              <w:jc w:val="right"/>
+            </w:pPr>
+            <w:proofErr w:type="gramStart"/>
+            <w:r>
+              <w:rPr>
+                <w:bCs/>
+                <w:lang w:val="pt-PT"/>
+              </w:rPr>
+              <w:t xml:space="preserve">{{ </w:t>
+            </w:r>
+            <w:proofErr w:type="spellStart"/>
+            <w:r>
+              <w:rPr>
+                <w:bCs/>
+                <w:lang w:val="pt-PT"/>
+              </w:rPr>
+              <w:t>firma</w:t>
+            </w:r>
+            <w:proofErr w:type="gramEnd"/>
+            <w:r>
+              <w:rPr>
+                <w:bCs/>
+                <w:lang w:val="pt-PT"/>
+              </w:rPr>
+              <w:t>_formador</w:t>
+            </w:r>
+            <w:proofErr w:type="spellEnd"/>
+            <w:r>
+              <w:rPr>
+                <w:bCs/>
+                <w:lang w:val="pt-PT"/>
+              </w:rPr>
+              <w:t xml:space="preserve"> }}</w:t>
+            </w:r>
+          </w:p>
+        </w:tc>
+      </w:tr>
+      <w:tr>
+        <w:trPr>
+          <w:jc w:val="center"/>
+        </w:trPr>
+        <w:tc>
+          <w:tcPr>
+            <w:tcW w:w="9697" w:type="dxa"/>
+            <w:gridSpan w:val="4"/>
+            <w:tcBorders>
+              <w:left w:val="single" w:sz="18" w:space="0" w:color="000000"/>
+              <w:bottom w:val="single" w:sz="18" w:space="0" w:color="000000"/>
+              <w:right w:val="single" w:sz="18" w:space="0" w:color="000000"/>
             </w:tcBorders>
           </w:tcPr>
           <w:p>
@@ -946,47 +881,19 @@
           </w:p>
         </w:tc>
       </w:tr>
-      <w:tr>
-        <w:trPr>
-          <w:jc w:val="center"/>
-        </w:trPr>
-        <w:tc>
-          <w:tcPr>
-            <w:tcW w:w="9687" w:type="dxa"/>
-            <w:gridSpan w:val="4"/>
-            <w:tcBorders>
-              <w:left w:val="single" w:sz="18" w:space="0" w:color="auto"/>
-              <w:bottom w:val="single" w:sz="18" w:space="0" w:color="auto"/>
-              <w:right w:val="single" w:sz="18" w:space="0" w:color="auto"/>
-            </w:tcBorders>
-          </w:tcPr>
-          <w:p>
-            <w:pPr>
-              <w:tabs>
-                <w:tab w:val="left" w:pos="993"/>
-              </w:tabs>
-              <w:spacing w:before="120" w:after="0" w:line="240" w:lineRule="auto"/>
-              <w:jc w:val="both"/>
-              <w:rPr>
-                <w:rFonts w:eastAsia="Times New Roman" w:cs="Times New Roman"/>
-                <w:b/>
-                <w:szCs w:val="20"/>
-                <w:lang w:val="es-ES" w:eastAsia="de-CH" w:bidi="ar-SA"/>
-              </w:rPr>
-            </w:pPr>
-          </w:p>
-        </w:tc>
-      </w:tr>
     </w:tbl>
     <w:p/>
     <w:sectPr>
-      <w:headerReference w:type="default" r:id="rId11"/>
-      <w:footerReference w:type="default" r:id="rId12"/>
-      <w:headerReference w:type="first" r:id="rId13"/>
-      <w:footerReference w:type="first" r:id="rId14"/>
+      <w:headerReference w:type="even" r:id="rId11"/>
+      <w:headerReference w:type="default" r:id="rId12"/>
+      <w:footerReference w:type="even" r:id="rId13"/>
+      <w:footerReference w:type="default" r:id="rId14"/>
+      <w:headerReference w:type="first" r:id="rId15"/>
+      <w:footerReference w:type="first" r:id="rId16"/>
       <w:pgSz w:w="11906" w:h="16838"/>
-      <w:pgMar w:top="567" w:right="567" w:bottom="567" w:left="567" w:header="709" w:footer="709" w:gutter="0"/>
-      <w:cols w:space="708"/>
+      <w:pgMar w:top="766" w:right="567" w:bottom="766" w:left="567" w:header="709" w:footer="709" w:gutter="0"/>
+      <w:cols w:space="720"/>
+      <w:formProt w:val="0"/>
       <w:titlePg/>
       <w:docGrid w:linePitch="360"/>
     </w:sectPr>
@@ -1024,8 +931,18 @@
   <w:p>
     <w:pPr>
       <w:pStyle w:val="Footer"/>
+    </w:pPr>
+  </w:p>
+</w:ftr>
+</file>
+
+<file path=word/footer2.xml><?xml version="1.0" encoding="utf-8"?>
+<w:ftr xmlns:wpc="http://schemas.microsoft.com/office/word/2010/wordprocessingCanvas" xmlns:cx="http://schemas.microsoft.com/office/drawing/2014/chartex" xmlns:cx1="http://schemas.microsoft.com/office/drawing/2015/9/8/chartex" xmlns:cx2="http://schemas.microsoft.com/office/drawing/2015/10/21/chartex" xmlns:cx3="http://schemas.microsoft.com/office/drawing/2016/5/9/chartex" xmlns:cx4="http://schemas.microsoft.com/office/drawing/2016/5/10/chartex" xmlns:cx5="http://schemas.microsoft.com/office/drawing/2016/5/11/chartex" xmlns:cx6="http://schemas.microsoft.com/office/drawing/2016/5/12/chartex" xmlns:cx7="http://schemas.microsoft.com/office/drawing/2016/5/13/chartex" xmlns:cx8="http://schemas.microsoft.com/office/drawing/2016/5/14/chartex" xmlns:mc="http://schemas.openxmlformats.org/markup-compatibility/2006" xmlns:aink="http://schemas.microsoft.com/office/drawing/2016/ink" xmlns:am3d="http://schemas.microsoft.com/office/drawing/2017/model3d" xmlns:o="urn:schemas-microsoft-com:office:office" xmlns:oel="http://schemas.microsoft.com/office/2019/extlst" xmlns:r="http://schemas.openxmlformats.org/officeDocument/2006/relationships" xmlns:m="http://schemas.openxmlformats.org/officeDocument/2006/math" xmlns:v="urn:schemas-microsoft-com:vml" xmlns:wp14="http://schemas.microsoft.com/office/word/2010/wordprocessingDrawing" xmlns:wp="http://schemas.openxmlformats.org/drawingml/2006/wordprocessingDrawing" xmlns:w10="urn:schemas-microsoft-com:office:word" xmlns:w="http://schemas.openxmlformats.org/wordprocessingml/2006/main" xmlns:w14="http://schemas.microsoft.com/office/word/2010/wordml" xmlns:w15="http://schemas.microsoft.com/office/word/2012/wordml" xmlns:w16cex="http://schemas.microsoft.com/office/word/2018/wordml/cex" xmlns:w16cid="http://schemas.microsoft.com/office/word/2016/wordml/cid" xmlns:w16="http://schemas.microsoft.com/office/word/2018/wordml" xmlns:w16du="http://schemas.microsoft.com/office/word/2023/wordml/word16du" xmlns:w16sdtdh="http://schemas.microsoft.com/office/word/2020/wordml/sdtdatahash" xmlns:w16sdtfl="http://schemas.microsoft.com/office/word/2024/wordml/sdtformatlock" xmlns:w16se="http://schemas.microsoft.com/office/word/2015/wordml/symex" xmlns:wpg="http://schemas.microsoft.com/office/word/2010/wordprocessingGroup" xmlns:wpi="http://schemas.microsoft.com/office/word/2010/wordprocessingInk" xmlns:wne="http://schemas.microsoft.com/office/word/2006/wordml" xmlns:wps="http://schemas.microsoft.com/office/word/2010/wordprocessingShape" mc:Ignorable="w14 w15 w16se w16cid w16 w16cex w16sdtdh w16sdtfl w16du wp14">
+  <w:p>
+    <w:pPr>
+      <w:pStyle w:val="Footer"/>
       <w:pBdr>
-        <w:top w:val="single" w:sz="4" w:space="1" w:color="auto"/>
+        <w:top w:val="single" w:sz="4" w:space="1" w:color="000000"/>
       </w:pBdr>
       <w:jc w:val="center"/>
       <w:rPr>
@@ -1038,21 +955,8 @@
         <w:color w:val="FF0000"/>
         <w:szCs w:val="12"/>
       </w:rPr>
-      <w:ptab w:relativeTo="margin" w:alignment="left" w:leader="none"/>
-    </w:r>
-    <w:r>
-      <w:rPr>
-        <w:color w:val="FF0000"/>
-        <w:szCs w:val="12"/>
-      </w:rPr>
-      <w:t xml:space="preserve"> </w:t>
-    </w:r>
-    <w:r>
-      <w:rPr>
-        <w:color w:val="FF0000"/>
-        <w:szCs w:val="12"/>
-      </w:rPr>
-      <w:t>Confidential and proprietary.</w:t>
+      <w:tab/>
+      <w:t xml:space="preserve"> Confidential and proprietary.</w:t>
     </w:r>
   </w:p>
   <w:p>
@@ -1061,31 +965,7 @@
       <w:jc w:val="center"/>
     </w:pPr>
     <w:r>
-      <w:t xml:space="preserve">This document and its contents are confidential and proprietary to </w:t>
-    </w:r>
-    <w:proofErr w:type="spellStart"/>
-    <w:r>
-      <w:t>Sonova</w:t>
-    </w:r>
-    <w:proofErr w:type="spellEnd"/>
-    <w:r>
-      <w:t xml:space="preserve"> and shall not be reproduced or otherwise disclosed to anyone other than </w:t>
-    </w:r>
-    <w:proofErr w:type="spellStart"/>
-    <w:r>
-      <w:t>Sonova</w:t>
-    </w:r>
-    <w:proofErr w:type="spellEnd"/>
-    <w:r>
-      <w:t xml:space="preserve"> employees without written authorization from </w:t>
-    </w:r>
-    <w:proofErr w:type="spellStart"/>
-    <w:r>
-      <w:t>Sonova</w:t>
-    </w:r>
-    <w:proofErr w:type="spellEnd"/>
-    <w:r>
-      <w:t>.</w:t>
+      <w:t>This document and its contents are confidential and proprietary to Sonova and shall not be reproduced or otherwise disclosed to anyone other than Sonova employees without written authorization from Sonova.</w:t>
     </w:r>
   </w:p>
   <w:p>
@@ -1094,13 +974,7 @@
       <w:jc w:val="center"/>
     </w:pPr>
     <w:r>
-      <w:t xml:space="preserve">This printout is an uncontrolled copy. The original is stored in </w:t>
-    </w:r>
-    <w:r>
-      <w:t>the</w:t>
-    </w:r>
-    <w:r>
-      <w:t xml:space="preserve"> Document Management System.</w:t>
+      <w:t>This printout is an uncontrolled copy. The original is stored in the Document Management System.</w:t>
     </w:r>
   </w:p>
   <w:p>
@@ -1108,25 +982,18 @@
       <w:pStyle w:val="Footer"/>
       <w:rPr>
         <w:rFonts w:eastAsia="DengXian" w:cs="Arial"/>
-        <w:noProof/>
         <w:lang w:bidi="ar-SA"/>
       </w:rPr>
     </w:pPr>
     <w:r>
       <w:rPr>
         <w:rFonts w:eastAsia="DengXian" w:cs="Arial"/>
-        <w:noProof/>
         <w:lang w:bidi="ar-SA"/>
       </w:rPr>
       <w:t xml:space="preserve">Template: </w:t>
     </w:r>
     <w:sdt>
       <w:sdtPr>
-        <w:rPr>
-          <w:rFonts w:eastAsia="DengXian" w:cs="Arial"/>
-          <w:noProof/>
-          <w:lang w:bidi="ar-SA"/>
-        </w:rPr>
         <w:id w:val="-333227915"/>
         <w:placeholder>
           <w:docPart w:val="2D62D999C8494A728E1356A0953DEFD4"/>
@@ -1138,13 +1005,7 @@
           <w:rPr>
             <w:rStyle w:val="PlaceholderText"/>
           </w:rPr>
-          <w:t>TPL-xx [y] (Doc ID / Version</w:t>
-        </w:r>
-        <w:r>
-          <w:rPr>
-            <w:rStyle w:val="PlaceholderText"/>
-          </w:rPr>
-          <w:t>)</w:t>
+          <w:t>TPL-xx [y] (Doc ID / Version)</w:t>
         </w:r>
       </w:sdtContent>
     </w:sdt>
@@ -1158,7 +1019,7 @@
       <w:rPr>
         <w:lang w:val="de-CH"/>
       </w:rPr>
-      <w:ptab w:relativeTo="margin" w:alignment="right" w:leader="none"/>
+      <w:tab/>
     </w:r>
     <w:r>
       <w:t xml:space="preserve">Page </w:t>
@@ -1173,9 +1034,9 @@
     <w:r>
       <w:rPr>
         <w:rFonts w:eastAsia="DengXian" w:cs="Arial"/>
-        <w:lang w:bidi="ar-SA"/>
-      </w:rPr>
-      <w:instrText xml:space="preserve"> PAGE   \* MERGEFORMAT </w:instrText>
+        <w:lang w:val="de-DE" w:bidi="ar-SA"/>
+      </w:rPr>
+      <w:instrText xml:space="preserve"> PAGE </w:instrText>
     </w:r>
     <w:r>
       <w:rPr>
@@ -1189,7 +1050,7 @@
         <w:rFonts w:eastAsia="DengXian" w:cs="Arial"/>
         <w:lang w:val="de-DE" w:bidi="ar-SA"/>
       </w:rPr>
-      <w:t>1</w:t>
+      <w:t>0</w:t>
     </w:r>
     <w:r>
       <w:rPr>
@@ -1217,7 +1078,7 @@
         <w:rFonts w:eastAsia="DengXian" w:cs="Arial"/>
         <w:lang w:bidi="ar-SA"/>
       </w:rPr>
-      <w:instrText xml:space="preserve"> NUMPAGES   \* MERGEFORMAT </w:instrText>
+      <w:instrText xml:space="preserve"> NUMPAGES </w:instrText>
     </w:r>
     <w:r>
       <w:rPr>
@@ -1231,12 +1092,11 @@
         <w:rFonts w:eastAsia="DengXian" w:cs="Arial"/>
         <w:lang w:bidi="ar-SA"/>
       </w:rPr>
-      <w:t>3</w:t>
+      <w:t>1</w:t>
     </w:r>
     <w:r>
       <w:rPr>
         <w:rFonts w:eastAsia="DengXian" w:cs="Arial"/>
-        <w:noProof/>
         <w:lang w:bidi="ar-SA"/>
       </w:rPr>
       <w:fldChar w:fldCharType="end"/>
@@ -1245,13 +1105,13 @@
 </w:ftr>
 </file>
 
-<file path=word/footer2.xml><?xml version="1.0" encoding="utf-8"?>
+<file path=word/footer3.xml><?xml version="1.0" encoding="utf-8"?>
 <w:ftr xmlns:wpc="http://schemas.microsoft.com/office/word/2010/wordprocessingCanvas" xmlns:cx="http://schemas.microsoft.com/office/drawing/2014/chartex" xmlns:cx1="http://schemas.microsoft.com/office/drawing/2015/9/8/chartex" xmlns:cx2="http://schemas.microsoft.com/office/drawing/2015/10/21/chartex" xmlns:cx3="http://schemas.microsoft.com/office/drawing/2016/5/9/chartex" xmlns:cx4="http://schemas.microsoft.com/office/drawing/2016/5/10/chartex" xmlns:cx5="http://schemas.microsoft.com/office/drawing/2016/5/11/chartex" xmlns:cx6="http://schemas.microsoft.com/office/drawing/2016/5/12/chartex" xmlns:cx7="http://schemas.microsoft.com/office/drawing/2016/5/13/chartex" xmlns:cx8="http://schemas.microsoft.com/office/drawing/2016/5/14/chartex" xmlns:mc="http://schemas.openxmlformats.org/markup-compatibility/2006" xmlns:aink="http://schemas.microsoft.com/office/drawing/2016/ink" xmlns:am3d="http://schemas.microsoft.com/office/drawing/2017/model3d" xmlns:o="urn:schemas-microsoft-com:office:office" xmlns:oel="http://schemas.microsoft.com/office/2019/extlst" xmlns:r="http://schemas.openxmlformats.org/officeDocument/2006/relationships" xmlns:m="http://schemas.openxmlformats.org/officeDocument/2006/math" xmlns:v="urn:schemas-microsoft-com:vml" xmlns:wp14="http://schemas.microsoft.com/office/word/2010/wordprocessingDrawing" xmlns:wp="http://schemas.openxmlformats.org/drawingml/2006/wordprocessingDrawing" xmlns:w10="urn:schemas-microsoft-com:office:word" xmlns:w="http://schemas.openxmlformats.org/wordprocessingml/2006/main" xmlns:w14="http://schemas.microsoft.com/office/word/2010/wordml" xmlns:w15="http://schemas.microsoft.com/office/word/2012/wordml" xmlns:w16cex="http://schemas.microsoft.com/office/word/2018/wordml/cex" xmlns:w16cid="http://schemas.microsoft.com/office/word/2016/wordml/cid" xmlns:w16="http://schemas.microsoft.com/office/word/2018/wordml" xmlns:w16du="http://schemas.microsoft.com/office/word/2023/wordml/word16du" xmlns:w16sdtdh="http://schemas.microsoft.com/office/word/2020/wordml/sdtdatahash" xmlns:w16sdtfl="http://schemas.microsoft.com/office/word/2024/wordml/sdtformatlock" xmlns:w16se="http://schemas.microsoft.com/office/word/2015/wordml/symex" xmlns:wpg="http://schemas.microsoft.com/office/word/2010/wordprocessingGroup" xmlns:wpi="http://schemas.microsoft.com/office/word/2010/wordprocessingInk" xmlns:wne="http://schemas.microsoft.com/office/word/2006/wordml" xmlns:wps="http://schemas.microsoft.com/office/word/2010/wordprocessingShape" mc:Ignorable="w14 w15 w16se w16cid w16 w16cex w16sdtdh w16sdtfl w16du wp14">
   <w:p>
     <w:pPr>
       <w:pStyle w:val="Footer"/>
       <w:pBdr>
-        <w:top w:val="single" w:sz="4" w:space="1" w:color="auto"/>
+        <w:top w:val="single" w:sz="4" w:space="1" w:color="000000"/>
       </w:pBdr>
       <w:jc w:val="center"/>
       <w:rPr>
@@ -1368,25 +1228,18 @@
       <w:pStyle w:val="Footer"/>
       <w:rPr>
         <w:rFonts w:eastAsia="DengXian" w:cs="Arial"/>
-        <w:noProof/>
         <w:lang w:bidi="ar-SA"/>
       </w:rPr>
     </w:pPr>
     <w:r>
       <w:rPr>
         <w:rFonts w:eastAsia="DengXian" w:cs="Arial"/>
-        <w:noProof/>
         <w:lang w:bidi="ar-SA"/>
       </w:rPr>
       <w:t xml:space="preserve">Template: </w:t>
     </w:r>
     <w:sdt>
       <w:sdtPr>
-        <w:rPr>
-          <w:rFonts w:eastAsia="DengXian" w:cs="Arial"/>
-          <w:noProof/>
-          <w:lang w:bidi="ar-SA"/>
-        </w:rPr>
         <w:id w:val="887917403"/>
         <w:placeholder>
           <w:docPart w:val="A5AB2A3916FB48BF81FF0372486625D8"/>
@@ -1396,26 +1249,9 @@
         <w:r>
           <w:rPr>
             <w:rFonts w:eastAsia="DengXian" w:cs="Arial"/>
-            <w:noProof/>
             <w:lang w:bidi="ar-SA"/>
           </w:rPr>
-          <w:t>TPL-707 [</w:t>
-        </w:r>
-        <w:r>
-          <w:rPr>
-            <w:rFonts w:eastAsia="DengXian" w:cs="Arial"/>
-            <w:noProof/>
-            <w:lang w:bidi="ar-SA"/>
-          </w:rPr>
-          <w:t>4</w:t>
-        </w:r>
-        <w:r>
-          <w:rPr>
-            <w:rFonts w:eastAsia="DengXian" w:cs="Arial"/>
-            <w:noProof/>
-            <w:lang w:bidi="ar-SA"/>
-          </w:rPr>
-          <w:t>]</w:t>
+          <w:t>TPL-707 [4]</w:t>
         </w:r>
       </w:sdtContent>
     </w:sdt>
@@ -1423,7 +1259,7 @@
       <w:rPr>
         <w:lang w:val="de-CH"/>
       </w:rPr>
-      <w:ptab w:relativeTo="margin" w:alignment="right" w:leader="none"/>
+      <w:tab/>
     </w:r>
     <w:r>
       <w:t xml:space="preserve">Page </w:t>
@@ -1438,9 +1274,9 @@
     <w:r>
       <w:rPr>
         <w:rFonts w:eastAsia="DengXian" w:cs="Arial"/>
-        <w:lang w:bidi="ar-SA"/>
-      </w:rPr>
-      <w:instrText xml:space="preserve"> PAGE   \* MERGEFORMAT </w:instrText>
+        <w:lang w:val="de-DE" w:bidi="ar-SA"/>
+      </w:rPr>
+      <w:instrText xml:space="preserve"> PAGE </w:instrText>
     </w:r>
     <w:r>
       <w:rPr>
@@ -1454,7 +1290,7 @@
         <w:rFonts w:eastAsia="DengXian" w:cs="Arial"/>
         <w:lang w:val="de-DE" w:bidi="ar-SA"/>
       </w:rPr>
-      <w:t>2</w:t>
+      <w:t>1</w:t>
     </w:r>
     <w:r>
       <w:rPr>
@@ -1482,7 +1318,7 @@
         <w:rFonts w:eastAsia="DengXian" w:cs="Arial"/>
         <w:lang w:bidi="ar-SA"/>
       </w:rPr>
-      <w:instrText xml:space="preserve"> NUMPAGES   \* MERGEFORMAT </w:instrText>
+      <w:instrText xml:space="preserve"> NUMPAGES </w:instrText>
     </w:r>
     <w:r>
       <w:rPr>
@@ -1496,12 +1332,11 @@
         <w:rFonts w:eastAsia="DengXian" w:cs="Arial"/>
         <w:lang w:bidi="ar-SA"/>
       </w:rPr>
-      <w:t>2</w:t>
+      <w:t>1</w:t>
     </w:r>
     <w:r>
       <w:rPr>
         <w:rFonts w:eastAsia="DengXian" w:cs="Arial"/>
-        <w:noProof/>
         <w:lang w:bidi="ar-SA"/>
       </w:rPr>
       <w:fldChar w:fldCharType="end"/>
@@ -1541,163 +1376,6 @@
     <w:pPr>
       <w:pStyle w:val="Header"/>
     </w:pPr>
-    <w:r>
-      <w:rPr>
-        <w:b/>
-        <w:bCs/>
-        <w:noProof/>
-        <w:lang w:val="de-CH" w:eastAsia="de-CH"/>
-      </w:rPr>
-      <w:drawing>
-        <wp:anchor distT="0" distB="0" distL="114300" distR="114300" simplePos="0" relativeHeight="251659264" behindDoc="0" locked="1" layoutInCell="1" allowOverlap="1" wp14:anchorId="59F05F08" wp14:editId="757A8E18">
-          <wp:simplePos x="0" y="0"/>
-          <wp:positionH relativeFrom="margin">
-            <wp:posOffset>-85725</wp:posOffset>
-          </wp:positionH>
-          <wp:positionV relativeFrom="page">
-            <wp:posOffset>350520</wp:posOffset>
-          </wp:positionV>
-          <wp:extent cx="1510030" cy="485140"/>
-          <wp:effectExtent l="0" t="0" r="0" b="0"/>
-          <wp:wrapNone/>
-          <wp:docPr id="14" name="logo_rgb_1"/>
-          <wp:cNvGraphicFramePr>
-            <a:graphicFrameLocks xmlns:a="http://schemas.openxmlformats.org/drawingml/2006/main" noChangeAspect="1"/>
-          </wp:cNvGraphicFramePr>
-          <a:graphic xmlns:a="http://schemas.openxmlformats.org/drawingml/2006/main">
-            <a:graphicData uri="http://schemas.openxmlformats.org/drawingml/2006/picture">
-              <pic:pic xmlns:pic="http://schemas.openxmlformats.org/drawingml/2006/picture">
-                <pic:nvPicPr>
-                  <pic:cNvPr id="0" name=""/>
-                  <pic:cNvPicPr/>
-                </pic:nvPicPr>
-                <pic:blipFill>
-                  <a:blip r:embed="rId1" cstate="print">
-                    <a:extLst>
-                      <a:ext uri="{28A0092B-C50C-407E-A947-70E740481C1C}">
-                        <a14:useLocalDpi xmlns:a14="http://schemas.microsoft.com/office/drawing/2010/main" val="0"/>
-                      </a:ext>
-                    </a:extLst>
-                  </a:blip>
-                  <a:stretch>
-                    <a:fillRect/>
-                  </a:stretch>
-                </pic:blipFill>
-                <pic:spPr>
-                  <a:xfrm>
-                    <a:off x="0" y="0"/>
-                    <a:ext cx="1510030" cy="485140"/>
-                  </a:xfrm>
-                  <a:prstGeom prst="rect">
-                    <a:avLst/>
-                  </a:prstGeom>
-                </pic:spPr>
-              </pic:pic>
-            </a:graphicData>
-          </a:graphic>
-          <wp14:sizeRelH relativeFrom="margin">
-            <wp14:pctWidth>0</wp14:pctWidth>
-          </wp14:sizeRelH>
-          <wp14:sizeRelV relativeFrom="margin">
-            <wp14:pctHeight>0</wp14:pctHeight>
-          </wp14:sizeRelV>
-        </wp:anchor>
-      </w:drawing>
-    </w:r>
-    <w:r>
-      <w:rPr>
-        <w:b/>
-        <w:bCs/>
-      </w:rPr>
-      <w:ptab w:relativeTo="margin" w:alignment="right" w:leader="none"/>
-    </w:r>
-    <w:r>
-      <w:rPr>
-        <w:b/>
-        <w:bCs/>
-      </w:rPr>
-      <w:t>DOC</w:t>
-    </w:r>
-    <w:r>
-      <w:t xml:space="preserve"> </w:t>
-    </w:r>
-    <w:r>
-      <w:rPr>
-        <w:rStyle w:val="Strong"/>
-      </w:rPr>
-      <w:t>ID</w:t>
-    </w:r>
-    <w:r>
-      <w:t xml:space="preserve">: </w:t>
-    </w:r>
-    <w:r>
-      <w:rPr>
-        <w:rStyle w:val="Strong"/>
-      </w:rPr>
-      <w:fldChar w:fldCharType="begin"/>
-    </w:r>
-    <w:r>
-      <w:rPr>
-        <w:rStyle w:val="Strong"/>
-      </w:rPr>
-      <w:instrText xml:space="preserve"> DOCPROPERTY  DOC_DOCUMENT_NO  \* MERGEFORMAT </w:instrText>
-    </w:r>
-    <w:r>
-      <w:rPr>
-        <w:rStyle w:val="Strong"/>
-      </w:rPr>
-      <w:fldChar w:fldCharType="separate"/>
-    </w:r>
-    <w:r>
-      <w:rPr>
-        <w:rStyle w:val="Strong"/>
-      </w:rPr>
-      <w:t>&lt;Do not edit&gt;</w:t>
-    </w:r>
-    <w:r>
-      <w:rPr>
-        <w:rStyle w:val="Strong"/>
-      </w:rPr>
-      <w:fldChar w:fldCharType="end"/>
-    </w:r>
-  </w:p>
-  <w:p>
-    <w:pPr>
-      <w:pStyle w:val="Header"/>
-    </w:pPr>
-    <w:r>
-      <w:ptab w:relativeTo="margin" w:alignment="right" w:leader="none"/>
-    </w:r>
-    <w:r>
-      <w:t xml:space="preserve">Version: </w:t>
-    </w:r>
-    <w:fldSimple w:instr="DOCPROPERTY  DOC_DOCUMENT_REV  \* MERGEFORMAT">
-      <w:r>
-        <w:t>&lt;Do not edit&gt;</w:t>
-      </w:r>
-    </w:fldSimple>
-  </w:p>
-  <w:p>
-    <w:pPr>
-      <w:pStyle w:val="Header"/>
-      <w:rPr>
-        <w:sz w:val="4"/>
-        <w:szCs w:val="4"/>
-      </w:rPr>
-    </w:pPr>
-  </w:p>
-  <w:p>
-    <w:pPr>
-      <w:pBdr>
-        <w:bottom w:val="single" w:sz="4" w:space="1" w:color="auto"/>
-        <w:between w:val="single" w:sz="4" w:space="1" w:color="auto"/>
-      </w:pBdr>
-      <w:rPr>
-        <w:sz w:val="6"/>
-        <w:szCs w:val="6"/>
-        <w:lang w:val="en-GB" w:eastAsia="de-CH" w:bidi="ar-SA"/>
-      </w:rPr>
-    </w:pPr>
   </w:p>
 </w:hdr>
 </file>
@@ -1707,19 +1385,13 @@
   <w:p>
     <w:pPr>
       <w:pStyle w:val="Header"/>
-      <w:rPr>
-        <w:lang w:val="es-ES"/>
-      </w:rPr>
     </w:pPr>
     <w:r>
       <w:rPr>
-        <w:b/>
-        <w:bCs/>
         <w:noProof/>
-        <w:lang w:val="de-CH" w:eastAsia="de-CH"/>
       </w:rPr>
       <w:drawing>
-        <wp:anchor distT="0" distB="0" distL="114300" distR="114300" simplePos="0" relativeHeight="251660288" behindDoc="0" locked="1" layoutInCell="1" allowOverlap="1" wp14:anchorId="79AA348A" wp14:editId="11AE7BDC">
+        <wp:anchor distT="0" distB="0" distL="0" distR="0" simplePos="0" relativeHeight="251658240" behindDoc="1" locked="0" layoutInCell="1" allowOverlap="1" wp14:anchorId="760E5409" wp14:editId="1EBADE99">
           <wp:simplePos x="0" y="0"/>
           <wp:positionH relativeFrom="margin">
             <wp:posOffset>-85725</wp:posOffset>
@@ -1738,22 +1410,18 @@
             <a:graphicData uri="http://schemas.openxmlformats.org/drawingml/2006/picture">
               <pic:pic xmlns:pic="http://schemas.openxmlformats.org/drawingml/2006/picture">
                 <pic:nvPicPr>
-                  <pic:cNvPr id="0" name=""/>
-                  <pic:cNvPicPr/>
+                  <pic:cNvPr id="1" name="logo_rgb_1"/>
+                  <pic:cNvPicPr>
+                    <a:picLocks noChangeAspect="1" noChangeArrowheads="1"/>
+                  </pic:cNvPicPr>
                 </pic:nvPicPr>
                 <pic:blipFill>
-                  <a:blip r:embed="rId1" cstate="print">
-                    <a:extLst>
-                      <a:ext uri="{28A0092B-C50C-407E-A947-70E740481C1C}">
-                        <a14:useLocalDpi xmlns:a14="http://schemas.microsoft.com/office/drawing/2010/main" val="0"/>
-                      </a:ext>
-                    </a:extLst>
-                  </a:blip>
+                  <a:blip r:embed="rId1"/>
                   <a:stretch>
                     <a:fillRect/>
                   </a:stretch>
                 </pic:blipFill>
-                <pic:spPr>
+                <pic:spPr bwMode="auto">
                   <a:xfrm>
                     <a:off x="0" y="0"/>
                     <a:ext cx="1510030" cy="485140"/>
@@ -1765,12 +1433,6 @@
               </pic:pic>
             </a:graphicData>
           </a:graphic>
-          <wp14:sizeRelH relativeFrom="margin">
-            <wp14:pctWidth>0</wp14:pctWidth>
-          </wp14:sizeRelH>
-          <wp14:sizeRelV relativeFrom="margin">
-            <wp14:pctHeight>0</wp14:pctHeight>
-          </wp14:sizeRelV>
         </wp:anchor>
       </w:drawing>
     </w:r>
@@ -1779,63 +1441,210 @@
         <w:b/>
         <w:bCs/>
       </w:rPr>
-      <w:ptab w:relativeTo="margin" w:alignment="right" w:leader="none"/>
-    </w:r>
-    <w:r>
-      <w:rPr>
-        <w:b/>
-        <w:bCs/>
-        <w:lang w:val="es-ES"/>
-      </w:rPr>
+      <w:tab/>
       <w:t>DOC</w:t>
     </w:r>
     <w:r>
-      <w:rPr>
-        <w:lang w:val="es-ES"/>
-      </w:rPr>
       <w:t xml:space="preserve"> </w:t>
     </w:r>
     <w:r>
       <w:rPr>
         <w:rStyle w:val="Strong"/>
-        <w:lang w:val="es-ES"/>
       </w:rPr>
       <w:t>ID</w:t>
     </w:r>
     <w:r>
-      <w:rPr>
-        <w:lang w:val="es-ES"/>
-      </w:rPr>
       <w:t xml:space="preserve">: </w:t>
     </w:r>
     <w:r>
       <w:rPr>
-        <w:lang w:val="es-ES"/>
-      </w:rPr>
-      <w:t>TPL-70</w:t>
-    </w:r>
-    <w:r>
-      <w:rPr>
-        <w:lang w:val="es-ES"/>
-      </w:rPr>
-      <w:t>7</w:t>
-    </w:r>
-    <w:r>
-      <w:rPr>
-        <w:lang w:val="es-ES"/>
-      </w:rPr>
-      <w:t xml:space="preserve"> </w:t>
+        <w:rStyle w:val="Strong"/>
+      </w:rPr>
+      <w:fldChar w:fldCharType="begin"/>
+    </w:r>
+    <w:r>
+      <w:rPr>
+        <w:rStyle w:val="Strong"/>
+      </w:rPr>
+      <w:instrText xml:space="preserve"> DOCPROPERTY "DOC_DOCUMENT_NO"</w:instrText>
+    </w:r>
+    <w:r>
+      <w:rPr>
+        <w:rStyle w:val="Strong"/>
+      </w:rPr>
+      <w:fldChar w:fldCharType="separate"/>
+    </w:r>
+    <w:r>
+      <w:rPr>
+        <w:rStyle w:val="Strong"/>
+      </w:rPr>
+      <w:t>&lt;Do not edit&gt;</w:t>
+    </w:r>
+    <w:r>
+      <w:rPr>
+        <w:rStyle w:val="Strong"/>
+      </w:rPr>
+      <w:fldChar w:fldCharType="end"/>
     </w:r>
   </w:p>
   <w:p>
     <w:pPr>
       <w:pStyle w:val="Header"/>
+    </w:pPr>
+    <w:r>
+      <w:tab/>
+      <w:t xml:space="preserve">Version: </w:t>
+    </w:r>
+    <w:r>
+      <w:fldChar w:fldCharType="begin"/>
+    </w:r>
+    <w:r>
+      <w:instrText xml:space="preserve"> DOCPROPERTY "DOC_DOCUMENT_REV"</w:instrText>
+    </w:r>
+    <w:r>
+      <w:fldChar w:fldCharType="separate"/>
+    </w:r>
+    <w:r>
+      <w:t>&lt;Do not edit&gt;</w:t>
+    </w:r>
+    <w:r>
+      <w:fldChar w:fldCharType="end"/>
+    </w:r>
+  </w:p>
+  <w:p>
+    <w:pPr>
+      <w:pStyle w:val="Header"/>
+      <w:rPr>
+        <w:sz w:val="4"/>
+        <w:szCs w:val="4"/>
+      </w:rPr>
+    </w:pPr>
+  </w:p>
+  <w:p>
+    <w:pPr>
+      <w:pBdr>
+        <w:bottom w:val="single" w:sz="4" w:space="1" w:color="000000"/>
+      </w:pBdr>
+      <w:rPr>
+        <w:sz w:val="6"/>
+        <w:szCs w:val="6"/>
+        <w:lang w:val="en-GB" w:eastAsia="de-CH" w:bidi="ar-SA"/>
+      </w:rPr>
+    </w:pPr>
+  </w:p>
+</w:hdr>
+</file>
+
+<file path=word/header3.xml><?xml version="1.0" encoding="utf-8"?>
+<w:hdr xmlns:wpc="http://schemas.microsoft.com/office/word/2010/wordprocessingCanvas" xmlns:cx="http://schemas.microsoft.com/office/drawing/2014/chartex" xmlns:cx1="http://schemas.microsoft.com/office/drawing/2015/9/8/chartex" xmlns:cx2="http://schemas.microsoft.com/office/drawing/2015/10/21/chartex" xmlns:cx3="http://schemas.microsoft.com/office/drawing/2016/5/9/chartex" xmlns:cx4="http://schemas.microsoft.com/office/drawing/2016/5/10/chartex" xmlns:cx5="http://schemas.microsoft.com/office/drawing/2016/5/11/chartex" xmlns:cx6="http://schemas.microsoft.com/office/drawing/2016/5/12/chartex" xmlns:cx7="http://schemas.microsoft.com/office/drawing/2016/5/13/chartex" xmlns:cx8="http://schemas.microsoft.com/office/drawing/2016/5/14/chartex" xmlns:mc="http://schemas.openxmlformats.org/markup-compatibility/2006" xmlns:aink="http://schemas.microsoft.com/office/drawing/2016/ink" xmlns:am3d="http://schemas.microsoft.com/office/drawing/2017/model3d" xmlns:o="urn:schemas-microsoft-com:office:office" xmlns:oel="http://schemas.microsoft.com/office/2019/extlst" xmlns:r="http://schemas.openxmlformats.org/officeDocument/2006/relationships" xmlns:m="http://schemas.openxmlformats.org/officeDocument/2006/math" xmlns:v="urn:schemas-microsoft-com:vml" xmlns:wp14="http://schemas.microsoft.com/office/word/2010/wordprocessingDrawing" xmlns:wp="http://schemas.openxmlformats.org/drawingml/2006/wordprocessingDrawing" xmlns:w10="urn:schemas-microsoft-com:office:word" xmlns:w="http://schemas.openxmlformats.org/wordprocessingml/2006/main" xmlns:w14="http://schemas.microsoft.com/office/word/2010/wordml" xmlns:w15="http://schemas.microsoft.com/office/word/2012/wordml" xmlns:w16cex="http://schemas.microsoft.com/office/word/2018/wordml/cex" xmlns:w16cid="http://schemas.microsoft.com/office/word/2016/wordml/cid" xmlns:w16="http://schemas.microsoft.com/office/word/2018/wordml" xmlns:w16du="http://schemas.microsoft.com/office/word/2023/wordml/word16du" xmlns:w16sdtdh="http://schemas.microsoft.com/office/word/2020/wordml/sdtdatahash" xmlns:w16sdtfl="http://schemas.microsoft.com/office/word/2024/wordml/sdtformatlock" xmlns:w16se="http://schemas.microsoft.com/office/word/2015/wordml/symex" xmlns:wpg="http://schemas.microsoft.com/office/word/2010/wordprocessingGroup" xmlns:wpi="http://schemas.microsoft.com/office/word/2010/wordprocessingInk" xmlns:wne="http://schemas.microsoft.com/office/word/2006/wordml" xmlns:wps="http://schemas.microsoft.com/office/word/2010/wordprocessingShape" mc:Ignorable="w14 w15 w16se w16cid w16 w16cex w16sdtdh w16sdtfl w16du wp14">
+  <w:p>
+    <w:pPr>
+      <w:pStyle w:val="Header"/>
+      <w:jc w:val="right"/>
       <w:rPr>
         <w:lang w:val="es-ES"/>
       </w:rPr>
     </w:pPr>
     <w:r>
-      <w:ptab w:relativeTo="margin" w:alignment="right" w:leader="none"/>
+      <w:rPr>
+        <w:noProof/>
+      </w:rPr>
+      <w:drawing>
+        <wp:anchor distT="0" distB="0" distL="0" distR="0" simplePos="0" relativeHeight="2" behindDoc="1" locked="0" layoutInCell="0" allowOverlap="1" wp14:anchorId="01FA5AD8" wp14:editId="7C7BB9FA">
+          <wp:simplePos x="0" y="0"/>
+          <wp:positionH relativeFrom="margin">
+            <wp:posOffset>-85725</wp:posOffset>
+          </wp:positionH>
+          <wp:positionV relativeFrom="page">
+            <wp:posOffset>350520</wp:posOffset>
+          </wp:positionV>
+          <wp:extent cx="1510030" cy="485140"/>
+          <wp:effectExtent l="0" t="0" r="0" b="0"/>
+          <wp:wrapNone/>
+          <wp:docPr id="2" name="Image2"/>
+          <wp:cNvGraphicFramePr>
+            <a:graphicFrameLocks xmlns:a="http://schemas.openxmlformats.org/drawingml/2006/main" noChangeAspect="1"/>
+          </wp:cNvGraphicFramePr>
+          <a:graphic xmlns:a="http://schemas.openxmlformats.org/drawingml/2006/main">
+            <a:graphicData uri="http://schemas.openxmlformats.org/drawingml/2006/picture">
+              <pic:pic xmlns:pic="http://schemas.openxmlformats.org/drawingml/2006/picture">
+                <pic:nvPicPr>
+                  <pic:cNvPr id="2" name="Image2"/>
+                  <pic:cNvPicPr>
+                    <a:picLocks noChangeAspect="1" noChangeArrowheads="1"/>
+                  </pic:cNvPicPr>
+                </pic:nvPicPr>
+                <pic:blipFill>
+                  <a:blip r:embed="rId1"/>
+                  <a:stretch>
+                    <a:fillRect/>
+                  </a:stretch>
+                </pic:blipFill>
+                <pic:spPr bwMode="auto">
+                  <a:xfrm>
+                    <a:off x="0" y="0"/>
+                    <a:ext cx="1510030" cy="485140"/>
+                  </a:xfrm>
+                  <a:prstGeom prst="rect">
+                    <a:avLst/>
+                  </a:prstGeom>
+                  <a:noFill/>
+                </pic:spPr>
+              </pic:pic>
+            </a:graphicData>
+          </a:graphic>
+        </wp:anchor>
+      </w:drawing>
+    </w:r>
+    <w:r>
+      <w:rPr>
+        <w:b/>
+        <w:bCs/>
+        <w:lang w:val="es-ES"/>
+      </w:rPr>
+      <w:tab/>
+    </w:r>
+    <w:r>
+      <w:rPr>
+        <w:b/>
+        <w:bCs/>
+        <w:lang w:val="es-ES"/>
+      </w:rPr>
+      <w:t>DOC</w:t>
+    </w:r>
+    <w:r>
+      <w:rPr>
+        <w:lang w:val="es-ES"/>
+      </w:rPr>
+      <w:t xml:space="preserve"> </w:t>
+    </w:r>
+    <w:r>
+      <w:rPr>
+        <w:rStyle w:val="Strong"/>
+        <w:lang w:val="es-ES"/>
+      </w:rPr>
+      <w:t>ID</w:t>
+    </w:r>
+    <w:r>
+      <w:rPr>
+        <w:lang w:val="es-ES"/>
+      </w:rPr>
+      <w:t xml:space="preserve">: TPL-707 </w:t>
+    </w:r>
+  </w:p>
+  <w:p>
+    <w:pPr>
+      <w:pStyle w:val="Header"/>
+      <w:jc w:val="right"/>
+      <w:rPr>
+        <w:lang w:val="es-ES"/>
+      </w:rPr>
+    </w:pPr>
+    <w:r>
+      <w:rPr>
+        <w:lang w:val="es-ES"/>
+      </w:rPr>
+      <w:tab/>
     </w:r>
     <w:proofErr w:type="spellStart"/>
     <w:r>
@@ -1849,19 +1658,7 @@
       <w:rPr>
         <w:lang w:val="es-ES"/>
       </w:rPr>
-      <w:t xml:space="preserve">: </w:t>
-    </w:r>
-    <w:r>
-      <w:rPr>
-        <w:lang w:val="es-ES"/>
-      </w:rPr>
-      <w:t>4</w:t>
-    </w:r>
-    <w:r>
-      <w:rPr>
-        <w:lang w:val="es-ES"/>
-      </w:rPr>
-      <w:t xml:space="preserve"> </w:t>
+      <w:t xml:space="preserve">: 4 </w:t>
     </w:r>
   </w:p>
   <w:p>
@@ -1885,19 +1682,13 @@
       <w:rPr>
         <w:lang w:val="es-ES"/>
       </w:rPr>
-      <w:t xml:space="preserve">RCSE </w:t>
-    </w:r>
-    <w:r>
-      <w:rPr>
-        <w:lang w:val="es-ES"/>
-      </w:rPr>
-      <w:t>Acta de formación de cursos</w:t>
+      <w:t>RCSE Acta de formación de cursos</w:t>
     </w:r>
   </w:p>
   <w:p>
     <w:pPr>
       <w:pBdr>
-        <w:bottom w:val="single" w:sz="4" w:space="1" w:color="auto"/>
+        <w:bottom w:val="single" w:sz="4" w:space="1" w:color="000000"/>
       </w:pBdr>
       <w:rPr>
         <w:sz w:val="4"/>
@@ -1912,100 +1703,9 @@
 <file path=word/numbering.xml><?xml version="1.0" encoding="utf-8"?>
 <w:numbering xmlns:wpc="http://schemas.microsoft.com/office/word/2010/wordprocessingCanvas" xmlns:cx="http://schemas.microsoft.com/office/drawing/2014/chartex" xmlns:cx1="http://schemas.microsoft.com/office/drawing/2015/9/8/chartex" xmlns:cx2="http://schemas.microsoft.com/office/drawing/2015/10/21/chartex" xmlns:cx3="http://schemas.microsoft.com/office/drawing/2016/5/9/chartex" xmlns:cx4="http://schemas.microsoft.com/office/drawing/2016/5/10/chartex" xmlns:cx5="http://schemas.microsoft.com/office/drawing/2016/5/11/chartex" xmlns:cx6="http://schemas.microsoft.com/office/drawing/2016/5/12/chartex" xmlns:cx7="http://schemas.microsoft.com/office/drawing/2016/5/13/chartex" xmlns:cx8="http://schemas.microsoft.com/office/drawing/2016/5/14/chartex" xmlns:mc="http://schemas.openxmlformats.org/markup-compatibility/2006" xmlns:aink="http://schemas.microsoft.com/office/drawing/2016/ink" xmlns:am3d="http://schemas.microsoft.com/office/drawing/2017/model3d" xmlns:o="urn:schemas-microsoft-com:office:office" xmlns:oel="http://schemas.microsoft.com/office/2019/extlst" xmlns:r="http://schemas.openxmlformats.org/officeDocument/2006/relationships" xmlns:m="http://schemas.openxmlformats.org/officeDocument/2006/math" xmlns:v="urn:schemas-microsoft-com:vml" xmlns:wp14="http://schemas.microsoft.com/office/word/2010/wordprocessingDrawing" xmlns:wp="http://schemas.openxmlformats.org/drawingml/2006/wordprocessingDrawing" xmlns:w10="urn:schemas-microsoft-com:office:word" xmlns:w="http://schemas.openxmlformats.org/wordprocessingml/2006/main" xmlns:w14="http://schemas.microsoft.com/office/word/2010/wordml" xmlns:w15="http://schemas.microsoft.com/office/word/2012/wordml" xmlns:w16cex="http://schemas.microsoft.com/office/word/2018/wordml/cex" xmlns:w16cid="http://schemas.microsoft.com/office/word/2016/wordml/cid" xmlns:w16="http://schemas.microsoft.com/office/word/2018/wordml" xmlns:w16du="http://schemas.microsoft.com/office/word/2023/wordml/word16du" xmlns:w16sdtdh="http://schemas.microsoft.com/office/word/2020/wordml/sdtdatahash" xmlns:w16sdtfl="http://schemas.microsoft.com/office/word/2024/wordml/sdtformatlock" xmlns:w16se="http://schemas.microsoft.com/office/word/2015/wordml/symex" xmlns:wpg="http://schemas.microsoft.com/office/word/2010/wordprocessingGroup" xmlns:wpi="http://schemas.microsoft.com/office/word/2010/wordprocessingInk" xmlns:wne="http://schemas.microsoft.com/office/word/2006/wordml" xmlns:wps="http://schemas.microsoft.com/office/word/2010/wordprocessingShape" mc:Ignorable="w14 w15 w16se w16cid w16 w16cex w16sdtdh w16sdtfl w16du wp14">
   <w:abstractNum w:abstractNumId="0" w15:restartNumberingAfterBreak="0">
-    <w:nsid w:val="33075B92"/>
-    <w:multiLevelType w:val="hybridMultilevel"/>
-    <w:tmpl w:val="BECACBFE"/>
-    <w:lvl w:ilvl="0" w:tplc="59964122">
-      <w:start w:val="1"/>
-      <w:numFmt w:val="decimal"/>
-      <w:lvlText w:val="[%1]"/>
-      <w:lvlJc w:val="left"/>
-      <w:pPr>
-        <w:ind w:left="720" w:hanging="360"/>
-      </w:pPr>
-      <w:rPr>
-        <w:rFonts w:hint="default"/>
-        <w:i w:val="0"/>
-        <w:iCs/>
-      </w:rPr>
-    </w:lvl>
-    <w:lvl w:ilvl="1" w:tplc="04090019" w:tentative="1">
-      <w:start w:val="1"/>
-      <w:numFmt w:val="lowerLetter"/>
-      <w:lvlText w:val="%2."/>
-      <w:lvlJc w:val="left"/>
-      <w:pPr>
-        <w:ind w:left="1440" w:hanging="360"/>
-      </w:pPr>
-    </w:lvl>
-    <w:lvl w:ilvl="2" w:tplc="0409001B" w:tentative="1">
-      <w:start w:val="1"/>
-      <w:numFmt w:val="lowerRoman"/>
-      <w:lvlText w:val="%3."/>
-      <w:lvlJc w:val="right"/>
-      <w:pPr>
-        <w:ind w:left="2160" w:hanging="180"/>
-      </w:pPr>
-    </w:lvl>
-    <w:lvl w:ilvl="3" w:tplc="0409000F" w:tentative="1">
-      <w:start w:val="1"/>
-      <w:numFmt w:val="decimal"/>
-      <w:lvlText w:val="%4."/>
-      <w:lvlJc w:val="left"/>
-      <w:pPr>
-        <w:ind w:left="2880" w:hanging="360"/>
-      </w:pPr>
-    </w:lvl>
-    <w:lvl w:ilvl="4" w:tplc="04090019" w:tentative="1">
-      <w:start w:val="1"/>
-      <w:numFmt w:val="lowerLetter"/>
-      <w:lvlText w:val="%5."/>
-      <w:lvlJc w:val="left"/>
-      <w:pPr>
-        <w:ind w:left="3600" w:hanging="360"/>
-      </w:pPr>
-    </w:lvl>
-    <w:lvl w:ilvl="5" w:tplc="0409001B" w:tentative="1">
-      <w:start w:val="1"/>
-      <w:numFmt w:val="lowerRoman"/>
-      <w:lvlText w:val="%6."/>
-      <w:lvlJc w:val="right"/>
-      <w:pPr>
-        <w:ind w:left="4320" w:hanging="180"/>
-      </w:pPr>
-    </w:lvl>
-    <w:lvl w:ilvl="6" w:tplc="0409000F" w:tentative="1">
-      <w:start w:val="1"/>
-      <w:numFmt w:val="decimal"/>
-      <w:lvlText w:val="%7."/>
-      <w:lvlJc w:val="left"/>
-      <w:pPr>
-        <w:ind w:left="5040" w:hanging="360"/>
-      </w:pPr>
-    </w:lvl>
-    <w:lvl w:ilvl="7" w:tplc="04090019" w:tentative="1">
-      <w:start w:val="1"/>
-      <w:numFmt w:val="lowerLetter"/>
-      <w:lvlText w:val="%8."/>
-      <w:lvlJc w:val="left"/>
-      <w:pPr>
-        <w:ind w:left="5760" w:hanging="360"/>
-      </w:pPr>
-    </w:lvl>
-    <w:lvl w:ilvl="8" w:tplc="0409001B" w:tentative="1">
-      <w:start w:val="1"/>
-      <w:numFmt w:val="lowerRoman"/>
-      <w:lvlText w:val="%9."/>
-      <w:lvlJc w:val="right"/>
-      <w:pPr>
-        <w:ind w:left="6480" w:hanging="180"/>
-      </w:pPr>
-    </w:lvl>
-  </w:abstractNum>
-  <w:abstractNum w:abstractNumId="1" w15:restartNumberingAfterBreak="0">
-    <w:nsid w:val="5A7E5BBA"/>
+    <w:nsid w:val="546A24B2"/>
     <w:multiLevelType w:val="multilevel"/>
-    <w:tmpl w:val="57C69EFA"/>
+    <w:tmpl w:val="FDF65288"/>
     <w:lvl w:ilvl="0">
       <w:start w:val="1"/>
       <w:numFmt w:val="decimal"/>
@@ -2043,16 +1743,15 @@
         <w:shadow w:val="0"/>
         <w:emboss w:val="0"/>
         <w:imprint w:val="0"/>
-        <w:noProof w:val="0"/>
         <w:vanish w:val="0"/>
         <w:spacing w:val="0"/>
         <w:kern w:val="0"/>
         <w:position w:val="0"/>
+        <w:sz w:val="22"/>
         <w:u w:val="none"/>
         <w:effect w:val="none"/>
         <w:vertAlign w:val="baseline"/>
         <w:em w:val="none"/>
-        <w:specVanish w:val="0"/>
         <w14:glow w14:rad="0">
           <w14:srgbClr w14:val="000000"/>
         </w14:glow>
@@ -2076,7 +1775,7 @@
         <w14:numForm w14:val="default"/>
         <w14:numSpacing w14:val="default"/>
         <w14:stylisticSets/>
-        <w14:cntxtAlts w14:val="0"/>
+        <w14:cntxtAlts/>
       </w:rPr>
     </w:lvl>
     <w:lvl w:ilvl="2">
@@ -2092,9 +1791,6 @@
         </w:tabs>
         <w:ind w:left="1080" w:hanging="720"/>
       </w:pPr>
-      <w:rPr>
-        <w:rFonts w:hint="default"/>
-      </w:rPr>
     </w:lvl>
     <w:lvl w:ilvl="3">
       <w:start w:val="1"/>
@@ -2108,9 +1804,6 @@
         </w:tabs>
         <w:ind w:left="1080" w:hanging="720"/>
       </w:pPr>
-      <w:rPr>
-        <w:rFonts w:hint="default"/>
-      </w:rPr>
     </w:lvl>
     <w:lvl w:ilvl="4">
       <w:start w:val="1"/>
@@ -2124,9 +1817,6 @@
         </w:tabs>
         <w:ind w:left="1440" w:hanging="1080"/>
       </w:pPr>
-      <w:rPr>
-        <w:rFonts w:hint="default"/>
-      </w:rPr>
     </w:lvl>
     <w:lvl w:ilvl="5">
       <w:start w:val="1"/>
@@ -2140,9 +1830,6 @@
         </w:tabs>
         <w:ind w:left="1440" w:hanging="1080"/>
       </w:pPr>
-      <w:rPr>
-        <w:rFonts w:hint="default"/>
-      </w:rPr>
     </w:lvl>
     <w:lvl w:ilvl="6">
       <w:start w:val="1"/>
@@ -2156,9 +1843,6 @@
         </w:tabs>
         <w:ind w:left="1800" w:hanging="1440"/>
       </w:pPr>
-      <w:rPr>
-        <w:rFonts w:hint="default"/>
-      </w:rPr>
     </w:lvl>
     <w:lvl w:ilvl="7">
       <w:start w:val="1"/>
@@ -2172,9 +1856,6 @@
         </w:tabs>
         <w:ind w:left="1800" w:hanging="1440"/>
       </w:pPr>
-      <w:rPr>
-        <w:rFonts w:hint="default"/>
-      </w:rPr>
     </w:lvl>
     <w:lvl w:ilvl="8">
       <w:start w:val="1"/>
@@ -2188,15 +1869,9 @@
         </w:tabs>
         <w:ind w:left="2160" w:hanging="1800"/>
       </w:pPr>
-      <w:rPr>
-        <w:rFonts w:hint="default"/>
-      </w:rPr>
     </w:lvl>
   </w:abstractNum>
-  <w:num w:numId="1" w16cid:durableId="2004891733">
-    <w:abstractNumId w:val="1"/>
-  </w:num>
-  <w:num w:numId="2" w16cid:durableId="1063985841">
+  <w:num w:numId="1" w16cid:durableId="902911899">
     <w:abstractNumId w:val="0"/>
   </w:num>
 </w:numbering>
@@ -2215,7 +1890,7 @@
     </w:rPrDefault>
     <w:pPrDefault>
       <w:pPr>
-        <w:spacing w:after="160" w:line="259" w:lineRule="auto"/>
+        <w:suppressAutoHyphens/>
       </w:pPr>
     </w:pPrDefault>
   </w:docDefaults>
@@ -2601,6 +2276,9 @@
     <w:name w:val="Normal"/>
     <w:qFormat/>
     <w:rsid w:val="00FB1711"/>
+    <w:pPr>
+      <w:spacing w:after="160" w:line="259" w:lineRule="auto"/>
+    </w:pPr>
     <w:rPr>
       <w:rFonts w:ascii="Arial" w:hAnsi="Arial"/>
     </w:rPr>
@@ -2619,9 +2297,6 @@
         <w:numId w:val="1"/>
       </w:numPr>
       <w:shd w:val="clear" w:color="auto" w:fill="E6E6E6"/>
-      <w:tabs>
-        <w:tab w:val="clear" w:pos="4410"/>
-      </w:tabs>
       <w:spacing w:before="240" w:after="120" w:line="240" w:lineRule="auto"/>
       <w:ind w:left="709" w:hanging="709"/>
       <w:outlineLvl w:val="0"/>
@@ -2649,8 +2324,7 @@
         <w:numId w:val="1"/>
       </w:numPr>
       <w:tabs>
-        <w:tab w:val="clear" w:pos="684"/>
-        <w:tab w:val="num" w:pos="360"/>
+        <w:tab w:val="left" w:pos="360"/>
       </w:tabs>
       <w:spacing w:before="120" w:after="120" w:line="240" w:lineRule="auto"/>
       <w:ind w:left="0" w:firstLine="0"/>
@@ -2681,8 +2355,7 @@
         <w:numId w:val="1"/>
       </w:numPr>
       <w:tabs>
-        <w:tab w:val="clear" w:pos="1080"/>
-        <w:tab w:val="num" w:pos="709"/>
+        <w:tab w:val="left" w:pos="709"/>
       </w:tabs>
       <w:spacing w:before="120" w:after="120" w:line="240" w:lineRule="auto"/>
       <w:ind w:hanging="1080"/>
@@ -2703,6 +2376,7 @@
     <w:next w:val="Normal"/>
     <w:link w:val="Heading4Char"/>
     <w:unhideWhenUsed/>
+    <w:qFormat/>
     <w:rsid w:val="00FB1711"/>
     <w:pPr>
       <w:numPr>
@@ -2712,6 +2386,7 @@
       <w:tabs>
         <w:tab w:val="left" w:pos="992"/>
       </w:tabs>
+      <w:ind w:hanging="1080"/>
       <w:outlineLvl w:val="3"/>
     </w:pPr>
     <w:rPr>
@@ -2750,6 +2425,7 @@
     <w:name w:val="Heading 1 Char"/>
     <w:basedOn w:val="DefaultParagraphFont"/>
     <w:link w:val="Heading1"/>
+    <w:qFormat/>
     <w:rsid w:val="00FB1711"/>
     <w:rPr>
       <w:rFonts w:ascii="Arial" w:eastAsia="Times New Roman" w:hAnsi="Arial" w:cs="Arial"/>
@@ -2764,6 +2440,7 @@
     <w:name w:val="Heading 2 Char"/>
     <w:basedOn w:val="DefaultParagraphFont"/>
     <w:link w:val="Heading2"/>
+    <w:qFormat/>
     <w:rsid w:val="00FB1711"/>
     <w:rPr>
       <w:rFonts w:ascii="Arial" w:eastAsia="Times New Roman" w:hAnsi="Arial" w:cs="Arial"/>
@@ -2778,6 +2455,7 @@
     <w:name w:val="Heading 3 Char"/>
     <w:basedOn w:val="DefaultParagraphFont"/>
     <w:link w:val="Heading3"/>
+    <w:qFormat/>
     <w:rsid w:val="00FB1711"/>
     <w:rPr>
       <w:rFonts w:ascii="Arial" w:eastAsia="Times New Roman" w:hAnsi="Arial" w:cs="Arial"/>
@@ -2792,6 +2470,7 @@
     <w:name w:val="Heading 4 Char"/>
     <w:basedOn w:val="DefaultParagraphFont"/>
     <w:link w:val="Heading4"/>
+    <w:qFormat/>
     <w:rsid w:val="00FB1711"/>
     <w:rPr>
       <w:rFonts w:ascii="Arial" w:eastAsia="Times New Roman" w:hAnsi="Arial" w:cs="Times New Roman"/>
@@ -2802,10 +2481,146 @@
       <w:lang w:eastAsia="de-CH" w:bidi="ar-SA"/>
     </w:rPr>
   </w:style>
+  <w:style w:type="character" w:customStyle="1" w:styleId="HeaderChar">
+    <w:name w:val="Header Char"/>
+    <w:basedOn w:val="DefaultParagraphFont"/>
+    <w:link w:val="Header"/>
+    <w:uiPriority w:val="99"/>
+    <w:qFormat/>
+    <w:rsid w:val="00FB1711"/>
+    <w:rPr>
+      <w:rFonts w:ascii="Arial" w:hAnsi="Arial"/>
+    </w:rPr>
+  </w:style>
+  <w:style w:type="character" w:customStyle="1" w:styleId="FooterChar">
+    <w:name w:val="Footer Char"/>
+    <w:basedOn w:val="DefaultParagraphFont"/>
+    <w:link w:val="Footer"/>
+    <w:uiPriority w:val="99"/>
+    <w:qFormat/>
+    <w:rsid w:val="00FB1711"/>
+    <w:rPr>
+      <w:rFonts w:ascii="Arial" w:hAnsi="Arial"/>
+      <w:color w:val="808080" w:themeColor="background1" w:themeShade="80"/>
+      <w:sz w:val="16"/>
+    </w:rPr>
+  </w:style>
+  <w:style w:type="character" w:styleId="Strong">
+    <w:name w:val="Strong"/>
+    <w:basedOn w:val="DefaultParagraphFont"/>
+    <w:uiPriority w:val="22"/>
+    <w:qFormat/>
+    <w:rsid w:val="00FB1711"/>
+    <w:rPr>
+      <w:b/>
+      <w:bCs/>
+    </w:rPr>
+  </w:style>
+  <w:style w:type="character" w:customStyle="1" w:styleId="TitleChar">
+    <w:name w:val="Title Char"/>
+    <w:basedOn w:val="DefaultParagraphFont"/>
+    <w:link w:val="Title"/>
+    <w:uiPriority w:val="10"/>
+    <w:qFormat/>
+    <w:rsid w:val="00FB1711"/>
+    <w:rPr>
+      <w:rFonts w:ascii="Arial" w:eastAsia="Arial Unicode MS" w:hAnsi="Arial" w:cs="Arial"/>
+      <w:b/>
+      <w:sz w:val="36"/>
+      <w:szCs w:val="20"/>
+      <w:shd w:val="clear" w:color="auto" w:fill="E6E6E6"/>
+      <w:lang w:eastAsia="de-CH" w:bidi="ar-SA"/>
+    </w:rPr>
+  </w:style>
+  <w:style w:type="character" w:styleId="PlaceholderText">
+    <w:name w:val="Placeholder Text"/>
+    <w:basedOn w:val="DefaultParagraphFont"/>
+    <w:uiPriority w:val="99"/>
+    <w:semiHidden/>
+    <w:qFormat/>
+    <w:rsid w:val="00FB1711"/>
+    <w:rPr>
+      <w:color w:val="808080"/>
+    </w:rPr>
+  </w:style>
+  <w:style w:type="character" w:styleId="Hyperlink">
+    <w:name w:val="Hyperlink"/>
+    <w:basedOn w:val="DefaultParagraphFont"/>
+    <w:uiPriority w:val="99"/>
+    <w:unhideWhenUsed/>
+    <w:rsid w:val="00FB1711"/>
+    <w:rPr>
+      <w:color w:val="0563C1" w:themeColor="hyperlink"/>
+      <w:u w:val="single"/>
+    </w:rPr>
+  </w:style>
+  <w:style w:type="character" w:customStyle="1" w:styleId="normaltextrun">
+    <w:name w:val="normaltextrun"/>
+    <w:basedOn w:val="DefaultParagraphFont"/>
+    <w:qFormat/>
+    <w:rsid w:val="00753648"/>
+  </w:style>
+  <w:style w:type="paragraph" w:customStyle="1" w:styleId="Heading">
+    <w:name w:val="Heading"/>
+    <w:basedOn w:val="Normal"/>
+    <w:next w:val="BodyText"/>
+    <w:qFormat/>
+    <w:pPr>
+      <w:keepNext/>
+      <w:spacing w:before="240" w:after="120"/>
+    </w:pPr>
+    <w:rPr>
+      <w:rFonts w:ascii="Liberation Sans" w:eastAsia="Microsoft YaHei" w:hAnsi="Liberation Sans" w:cs="Arial"/>
+      <w:sz w:val="28"/>
+      <w:szCs w:val="28"/>
+    </w:rPr>
+  </w:style>
+  <w:style w:type="paragraph" w:styleId="BodyText">
+    <w:name w:val="Body Text"/>
+    <w:basedOn w:val="Normal"/>
+    <w:pPr>
+      <w:spacing w:after="140" w:line="276" w:lineRule="auto"/>
+    </w:pPr>
+  </w:style>
+  <w:style w:type="paragraph" w:styleId="List">
+    <w:name w:val="List"/>
+    <w:basedOn w:val="BodyText"/>
+    <w:rPr>
+      <w:rFonts w:cs="Arial"/>
+    </w:rPr>
+  </w:style>
+  <w:style w:type="paragraph" w:styleId="Caption">
+    <w:name w:val="caption"/>
+    <w:basedOn w:val="Normal"/>
+    <w:qFormat/>
+    <w:pPr>
+      <w:suppressLineNumbers/>
+      <w:spacing w:before="120" w:after="120"/>
+    </w:pPr>
+    <w:rPr>
+      <w:rFonts w:cs="Arial"/>
+      <w:i/>
+      <w:iCs/>
+      <w:sz w:val="24"/>
+      <w:szCs w:val="24"/>
+    </w:rPr>
+  </w:style>
+  <w:style w:type="paragraph" w:customStyle="1" w:styleId="Index">
+    <w:name w:val="Index"/>
+    <w:basedOn w:val="Normal"/>
+    <w:qFormat/>
+    <w:pPr>
+      <w:suppressLineNumbers/>
+    </w:pPr>
+    <w:rPr>
+      <w:rFonts w:cs="Arial"/>
+    </w:rPr>
+  </w:style>
   <w:style w:type="paragraph" w:customStyle="1" w:styleId="Comment">
     <w:name w:val="Comment"/>
     <w:basedOn w:val="Normal"/>
     <w:next w:val="Normal"/>
+    <w:qFormat/>
     <w:rsid w:val="00FB1711"/>
     <w:pPr>
       <w:spacing w:after="0" w:line="240" w:lineRule="auto"/>
@@ -2839,7 +2654,6 @@
     <w:rPr>
       <w:rFonts w:eastAsia="Times New Roman" w:cs="Arial"/>
       <w:b/>
-      <w:noProof/>
       <w:lang w:val="en-GB" w:eastAsia="de-CH" w:bidi="ar-SA"/>
     </w:rPr>
   </w:style>
@@ -2860,7 +2674,6 @@
     </w:pPr>
     <w:rPr>
       <w:rFonts w:eastAsia="Times New Roman" w:cs="Arial"/>
-      <w:noProof/>
       <w:lang w:val="en-GB" w:eastAsia="de-CH" w:bidi="ar-SA"/>
     </w:rPr>
   </w:style>
@@ -2873,22 +2686,33 @@
     <w:unhideWhenUsed/>
     <w:rsid w:val="00FB1711"/>
   </w:style>
+  <w:style w:type="paragraph" w:styleId="IndexHeading">
+    <w:name w:val="index heading"/>
+    <w:basedOn w:val="Heading"/>
+  </w:style>
   <w:style w:type="paragraph" w:styleId="TOCHeading">
     <w:name w:val="TOC Heading"/>
     <w:basedOn w:val="Heading1"/>
     <w:next w:val="Normal"/>
     <w:uiPriority w:val="39"/>
     <w:unhideWhenUsed/>
+    <w:qFormat/>
     <w:rsid w:val="00FB1711"/>
     <w:pPr>
       <w:numPr>
         <w:numId w:val="0"/>
       </w:numPr>
+      <w:ind w:left="709" w:hanging="709"/>
       <w:outlineLvl w:val="9"/>
     </w:pPr>
     <w:rPr>
       <w:lang w:eastAsia="en-US"/>
     </w:rPr>
+  </w:style>
+  <w:style w:type="paragraph" w:customStyle="1" w:styleId="HeaderandFooter">
+    <w:name w:val="Header and Footer"/>
+    <w:basedOn w:val="Normal"/>
+    <w:qFormat/>
   </w:style>
   <w:style w:type="paragraph" w:styleId="Header">
     <w:name w:val="header"/>
@@ -2904,16 +2728,6 @@
       </w:tabs>
       <w:spacing w:after="0" w:line="240" w:lineRule="auto"/>
     </w:pPr>
-  </w:style>
-  <w:style w:type="character" w:customStyle="1" w:styleId="HeaderChar">
-    <w:name w:val="Header Char"/>
-    <w:basedOn w:val="DefaultParagraphFont"/>
-    <w:link w:val="Header"/>
-    <w:uiPriority w:val="99"/>
-    <w:rsid w:val="00FB1711"/>
-    <w:rPr>
-      <w:rFonts w:ascii="Arial" w:hAnsi="Arial"/>
-    </w:rPr>
   </w:style>
   <w:style w:type="paragraph" w:styleId="Footer">
     <w:name w:val="footer"/>
@@ -2932,29 +2746,6 @@
     <w:rPr>
       <w:color w:val="808080" w:themeColor="background1" w:themeShade="80"/>
       <w:sz w:val="16"/>
-    </w:rPr>
-  </w:style>
-  <w:style w:type="character" w:customStyle="1" w:styleId="FooterChar">
-    <w:name w:val="Footer Char"/>
-    <w:basedOn w:val="DefaultParagraphFont"/>
-    <w:link w:val="Footer"/>
-    <w:uiPriority w:val="99"/>
-    <w:rsid w:val="00FB1711"/>
-    <w:rPr>
-      <w:rFonts w:ascii="Arial" w:hAnsi="Arial"/>
-      <w:color w:val="808080" w:themeColor="background1" w:themeShade="80"/>
-      <w:sz w:val="16"/>
-    </w:rPr>
-  </w:style>
-  <w:style w:type="character" w:styleId="Strong">
-    <w:name w:val="Strong"/>
-    <w:basedOn w:val="DefaultParagraphFont"/>
-    <w:uiPriority w:val="22"/>
-    <w:qFormat/>
-    <w:rsid w:val="00FB1711"/>
-    <w:rPr>
-      <w:b/>
-      <w:bCs/>
     </w:rPr>
   </w:style>
   <w:style w:type="paragraph" w:styleId="Title">
@@ -2979,42 +2770,6 @@
       <w:lang w:eastAsia="de-CH" w:bidi="ar-SA"/>
     </w:rPr>
   </w:style>
-  <w:style w:type="character" w:customStyle="1" w:styleId="TitleChar">
-    <w:name w:val="Title Char"/>
-    <w:basedOn w:val="DefaultParagraphFont"/>
-    <w:link w:val="Title"/>
-    <w:uiPriority w:val="10"/>
-    <w:rsid w:val="00FB1711"/>
-    <w:rPr>
-      <w:rFonts w:ascii="Arial" w:eastAsia="Arial Unicode MS" w:hAnsi="Arial" w:cs="Arial"/>
-      <w:b/>
-      <w:sz w:val="36"/>
-      <w:szCs w:val="20"/>
-      <w:shd w:val="clear" w:color="auto" w:fill="E6E6E6"/>
-      <w:lang w:eastAsia="de-CH" w:bidi="ar-SA"/>
-    </w:rPr>
-  </w:style>
-  <w:style w:type="character" w:styleId="PlaceholderText">
-    <w:name w:val="Placeholder Text"/>
-    <w:basedOn w:val="DefaultParagraphFont"/>
-    <w:uiPriority w:val="99"/>
-    <w:semiHidden/>
-    <w:rsid w:val="00FB1711"/>
-    <w:rPr>
-      <w:color w:val="808080"/>
-    </w:rPr>
-  </w:style>
-  <w:style w:type="character" w:styleId="Hyperlink">
-    <w:name w:val="Hyperlink"/>
-    <w:basedOn w:val="DefaultParagraphFont"/>
-    <w:uiPriority w:val="99"/>
-    <w:unhideWhenUsed/>
-    <w:rsid w:val="00FB1711"/>
-    <w:rPr>
-      <w:color w:val="0563C1" w:themeColor="hyperlink"/>
-      <w:u w:val="single"/>
-    </w:rPr>
-  </w:style>
   <w:style w:type="paragraph" w:styleId="ListParagraph">
     <w:name w:val="List Paragraph"/>
     <w:basedOn w:val="Normal"/>
@@ -3032,12 +2787,6 @@
     <w:basedOn w:val="TableNormal"/>
     <w:uiPriority w:val="99"/>
     <w:rsid w:val="00FB1711"/>
-    <w:pPr>
-      <w:spacing w:after="0" w:line="240" w:lineRule="auto"/>
-    </w:pPr>
-    <w:rPr>
-      <w:rFonts w:ascii="Arial" w:hAnsi="Arial"/>
-    </w:rPr>
     <w:tblPr>
       <w:tblBorders>
         <w:top w:val="single" w:sz="4" w:space="0" w:color="auto"/>
@@ -3056,7 +2805,6 @@
     </w:tblPr>
     <w:tblStylePr w:type="firstRow">
       <w:rPr>
-        <w:rFonts w:ascii="Arial" w:hAnsi="Arial"/>
         <w:b/>
         <w:sz w:val="22"/>
       </w:rPr>
@@ -3082,11 +2830,6 @@
         <w:shd w:val="clear" w:color="auto" w:fill="FFFFFF" w:themeFill="background1"/>
       </w:tcPr>
     </w:tblStylePr>
-  </w:style>
-  <w:style w:type="character" w:customStyle="1" w:styleId="normaltextrun">
-    <w:name w:val="normaltextrun"/>
-    <w:basedOn w:val="DefaultParagraphFont"/>
-    <w:rsid w:val="00753648"/>
   </w:style>
 </w:styles>
 </file>
@@ -3184,13 +2927,13 @@
     <w:pitch w:val="variable"/>
     <w:sig w:usb0="E4002EFF" w:usb1="C200247B" w:usb2="00000009" w:usb3="00000000" w:csb0="000001FF" w:csb1="00000000"/>
   </w:font>
-  <w:font w:name="DengXian">
-    <w:altName w:val="等线"/>
+  <w:font w:name="SimSun">
+    <w:altName w:val="宋体"/>
     <w:panose1 w:val="02010600030101010101"/>
     <w:charset w:val="86"/>
     <w:family w:val="auto"/>
     <w:pitch w:val="variable"/>
-    <w:sig w:usb0="A00002BF" w:usb1="38CF7CFA" w:usb2="00000016" w:usb3="00000000" w:csb0="0004000F" w:csb1="00000000"/>
+    <w:sig w:usb0="00000203" w:usb1="288F0000" w:usb2="00000016" w:usb3="00000000" w:csb0="00040001" w:csb1="00000000"/>
   </w:font>
   <w:font w:name="Arial">
     <w:panose1 w:val="020B0604020202020204"/>
@@ -3206,12 +2949,32 @@
     <w:pitch w:val="variable"/>
     <w:sig w:usb0="00000003" w:usb1="00000000" w:usb2="00000000" w:usb3="00000000" w:csb0="00000001" w:csb1="00000000"/>
   </w:font>
-  <w:font w:name="DengXian Light">
-    <w:altName w:val="等线 Light"/>
+  <w:font w:name="Liberation Sans">
+    <w:altName w:val="Arial"/>
+    <w:charset w:val="00"/>
+    <w:family w:val="swiss"/>
+    <w:pitch w:val="variable"/>
+  </w:font>
+  <w:font w:name="Microsoft YaHei">
+    <w:panose1 w:val="00000000000000000000"/>
+    <w:charset w:val="00"/>
+    <w:family w:val="roman"/>
+    <w:notTrueType/>
+    <w:pitch w:val="default"/>
+  </w:font>
+  <w:font w:name="DengXian">
+    <w:panose1 w:val="02010600030101010101"/>
     <w:charset w:val="86"/>
     <w:family w:val="auto"/>
     <w:pitch w:val="variable"/>
     <w:sig w:usb0="A00002BF" w:usb1="38CF7CFA" w:usb2="00000016" w:usb3="00000000" w:csb0="0004000F" w:csb1="00000000"/>
+  </w:font>
+  <w:font w:name="SimHei">
+    <w:panose1 w:val="02010600030101010101"/>
+    <w:charset w:val="86"/>
+    <w:family w:val="modern"/>
+    <w:pitch w:val="fixed"/>
+    <w:sig w:usb0="800002BF" w:usb1="38CF7CFA" w:usb2="00000016" w:usb3="00000000" w:csb0="00040001" w:csb1="00000000"/>
   </w:font>
   <w:font w:name="Calibri Light">
     <w:panose1 w:val="020F0302020204030204"/>
@@ -3225,6 +2988,12 @@
     <w:family w:val="swiss"/>
     <w:pitch w:val="variable"/>
     <w:sig w:usb0="20000287" w:usb1="00000003" w:usb2="00000000" w:usb3="00000000" w:csb0="0000019F" w:csb1="00000000"/>
+  </w:font>
+  <w:font w:name="DengXian Light">
+    <w:charset w:val="86"/>
+    <w:family w:val="auto"/>
+    <w:pitch w:val="variable"/>
+    <w:sig w:usb0="A00002BF" w:usb1="38CF7CFA" w:usb2="00000016" w:usb3="00000000" w:csb0="0004000F" w:csb1="00000000"/>
   </w:font>
   <w:font w:name="Aptos Display">
     <w:charset w:val="00"/>
@@ -3259,6 +3028,7 @@
     <w:rsid w:val="003A6928"/>
     <w:rsid w:val="003B4F59"/>
     <w:rsid w:val="003D2C3F"/>
+    <w:rsid w:val="004A3F87"/>
     <w:rsid w:val="004B6487"/>
     <w:rsid w:val="004D30E3"/>
     <w:rsid w:val="00562B6C"/>
@@ -3270,6 +3040,7 @@
     <w:rsid w:val="008D39B6"/>
     <w:rsid w:val="008E7211"/>
     <w:rsid w:val="00906484"/>
+    <w:rsid w:val="009B0B81"/>
     <w:rsid w:val="00C81F42"/>
     <w:rsid w:val="00CB5E48"/>
     <w:rsid w:val="00CE6EBD"/>
@@ -3782,10 +3553,10 @@
   <a:themeElements>
     <a:clrScheme name="Office">
       <a:dk1>
-        <a:sysClr val="windowText" lastClr="000000"/>
+        <a:srgbClr val="000000"/>
       </a:dk1>
       <a:lt1>
-        <a:sysClr val="window" lastClr="FFFFFF"/>
+        <a:srgbClr val="FFFFFF"/>
       </a:lt1>
       <a:dk2>
         <a:srgbClr val="44546A"/>
@@ -3823,150 +3594,52 @@
         <a:latin typeface="Calibri Light" panose="020F0302020204030204"/>
         <a:ea typeface=""/>
         <a:cs typeface=""/>
-        <a:font script="Jpan" typeface="游ゴシック Light"/>
-        <a:font script="Hang" typeface="맑은 고딕"/>
-        <a:font script="Hans" typeface="等线 Light"/>
-        <a:font script="Hant" typeface="新細明體"/>
-        <a:font script="Arab" typeface="Times New Roman"/>
-        <a:font script="Hebr" typeface="Times New Roman"/>
-        <a:font script="Thai" typeface="Angsana New"/>
-        <a:font script="Ethi" typeface="Nyala"/>
-        <a:font script="Beng" typeface="Vrinda"/>
-        <a:font script="Gujr" typeface="Shruti"/>
-        <a:font script="Khmr" typeface="MoolBoran"/>
-        <a:font script="Knda" typeface="Tunga"/>
-        <a:font script="Guru" typeface="Raavi"/>
-        <a:font script="Cans" typeface="Euphemia"/>
-        <a:font script="Cher" typeface="Plantagenet Cherokee"/>
-        <a:font script="Yiii" typeface="Microsoft Yi Baiti"/>
-        <a:font script="Tibt" typeface="Microsoft Himalaya"/>
-        <a:font script="Thaa" typeface="MV Boli"/>
-        <a:font script="Deva" typeface="Mangal"/>
-        <a:font script="Telu" typeface="Gautami"/>
-        <a:font script="Taml" typeface="Latha"/>
-        <a:font script="Syrc" typeface="Estrangelo Edessa"/>
-        <a:font script="Orya" typeface="Kalinga"/>
-        <a:font script="Mlym" typeface="Kartika"/>
-        <a:font script="Laoo" typeface="DokChampa"/>
-        <a:font script="Sinh" typeface="Iskoola Pota"/>
-        <a:font script="Mong" typeface="Mongolian Baiti"/>
-        <a:font script="Viet" typeface="Times New Roman"/>
-        <a:font script="Uigh" typeface="Microsoft Uighur"/>
-        <a:font script="Geor" typeface="Sylfaen"/>
-        <a:font script="Armn" typeface="Arial"/>
-        <a:font script="Bugi" typeface="Leelawadee UI"/>
-        <a:font script="Bopo" typeface="Microsoft JhengHei"/>
-        <a:font script="Java" typeface="Javanese Text"/>
-        <a:font script="Lisu" typeface="Segoe UI"/>
-        <a:font script="Mymr" typeface="Myanmar Text"/>
-        <a:font script="Nkoo" typeface="Ebrima"/>
-        <a:font script="Olck" typeface="Nirmala UI"/>
-        <a:font script="Osma" typeface="Ebrima"/>
-        <a:font script="Phag" typeface="Phagspa"/>
-        <a:font script="Syrn" typeface="Estrangelo Edessa"/>
-        <a:font script="Syrj" typeface="Estrangelo Edessa"/>
-        <a:font script="Syre" typeface="Estrangelo Edessa"/>
-        <a:font script="Sora" typeface="Nirmala UI"/>
-        <a:font script="Tale" typeface="Microsoft Tai Le"/>
-        <a:font script="Talu" typeface="Microsoft New Tai Lue"/>
-        <a:font script="Tfng" typeface="Ebrima"/>
       </a:majorFont>
       <a:minorFont>
         <a:latin typeface="Calibri" panose="020F0502020204030204"/>
         <a:ea typeface=""/>
         <a:cs typeface=""/>
-        <a:font script="Jpan" typeface="游明朝"/>
-        <a:font script="Hang" typeface="맑은 고딕"/>
-        <a:font script="Hans" typeface="等线"/>
-        <a:font script="Hant" typeface="新細明體"/>
-        <a:font script="Arab" typeface="Arial"/>
-        <a:font script="Hebr" typeface="Arial"/>
-        <a:font script="Thai" typeface="Cordia New"/>
-        <a:font script="Ethi" typeface="Nyala"/>
-        <a:font script="Beng" typeface="Vrinda"/>
-        <a:font script="Gujr" typeface="Shruti"/>
-        <a:font script="Khmr" typeface="DaunPenh"/>
-        <a:font script="Knda" typeface="Tunga"/>
-        <a:font script="Guru" typeface="Raavi"/>
-        <a:font script="Cans" typeface="Euphemia"/>
-        <a:font script="Cher" typeface="Plantagenet Cherokee"/>
-        <a:font script="Yiii" typeface="Microsoft Yi Baiti"/>
-        <a:font script="Tibt" typeface="Microsoft Himalaya"/>
-        <a:font script="Thaa" typeface="MV Boli"/>
-        <a:font script="Deva" typeface="Mangal"/>
-        <a:font script="Telu" typeface="Gautami"/>
-        <a:font script="Taml" typeface="Latha"/>
-        <a:font script="Syrc" typeface="Estrangelo Edessa"/>
-        <a:font script="Orya" typeface="Kalinga"/>
-        <a:font script="Mlym" typeface="Kartika"/>
-        <a:font script="Laoo" typeface="DokChampa"/>
-        <a:font script="Sinh" typeface="Iskoola Pota"/>
-        <a:font script="Mong" typeface="Mongolian Baiti"/>
-        <a:font script="Viet" typeface="Arial"/>
-        <a:font script="Uigh" typeface="Microsoft Uighur"/>
-        <a:font script="Geor" typeface="Sylfaen"/>
-        <a:font script="Armn" typeface="Arial"/>
-        <a:font script="Bugi" typeface="Leelawadee UI"/>
-        <a:font script="Bopo" typeface="Microsoft JhengHei"/>
-        <a:font script="Java" typeface="Javanese Text"/>
-        <a:font script="Lisu" typeface="Segoe UI"/>
-        <a:font script="Mymr" typeface="Myanmar Text"/>
-        <a:font script="Nkoo" typeface="Ebrima"/>
-        <a:font script="Olck" typeface="Nirmala UI"/>
-        <a:font script="Osma" typeface="Ebrima"/>
-        <a:font script="Phag" typeface="Phagspa"/>
-        <a:font script="Syrn" typeface="Estrangelo Edessa"/>
-        <a:font script="Syrj" typeface="Estrangelo Edessa"/>
-        <a:font script="Syre" typeface="Estrangelo Edessa"/>
-        <a:font script="Sora" typeface="Nirmala UI"/>
-        <a:font script="Tale" typeface="Microsoft Tai Le"/>
-        <a:font script="Talu" typeface="Microsoft New Tai Lue"/>
-        <a:font script="Tfng" typeface="Ebrima"/>
       </a:minorFont>
     </a:fontScheme>
-    <a:fmtScheme name="Office">
+    <a:fmtScheme>
       <a:fillStyleLst>
         <a:solidFill>
           <a:schemeClr val="phClr"/>
         </a:solidFill>
-        <a:gradFill rotWithShape="1">
+        <a:gradFill>
           <a:gsLst>
             <a:gs pos="0">
               <a:schemeClr val="phClr">
                 <a:lumMod val="110000"/>
-                <a:satMod val="105000"/>
                 <a:tint val="67000"/>
               </a:schemeClr>
             </a:gs>
             <a:gs pos="50000">
               <a:schemeClr val="phClr">
                 <a:lumMod val="105000"/>
-                <a:satMod val="103000"/>
                 <a:tint val="73000"/>
               </a:schemeClr>
             </a:gs>
             <a:gs pos="100000">
               <a:schemeClr val="phClr">
                 <a:lumMod val="105000"/>
-                <a:satMod val="109000"/>
                 <a:tint val="81000"/>
               </a:schemeClr>
             </a:gs>
           </a:gsLst>
           <a:lin ang="5400000" scaled="0"/>
+          <a:tileRect/>
         </a:gradFill>
-        <a:gradFill rotWithShape="1">
+        <a:gradFill>
           <a:gsLst>
             <a:gs pos="0">
               <a:schemeClr val="phClr">
-                <a:satMod val="103000"/>
                 <a:lumMod val="102000"/>
                 <a:tint val="94000"/>
               </a:schemeClr>
             </a:gs>
             <a:gs pos="50000">
               <a:schemeClr val="phClr">
-                <a:satMod val="110000"/>
                 <a:lumMod val="100000"/>
                 <a:shade val="100000"/>
               </a:schemeClr>
@@ -3974,33 +3647,24 @@
             <a:gs pos="100000">
               <a:schemeClr val="phClr">
                 <a:lumMod val="99000"/>
-                <a:satMod val="120000"/>
                 <a:shade val="78000"/>
               </a:schemeClr>
             </a:gs>
           </a:gsLst>
           <a:lin ang="5400000" scaled="0"/>
+          <a:tileRect/>
         </a:gradFill>
       </a:fillStyleLst>
       <a:lnStyleLst>
         <a:ln w="6350" cap="flat" cmpd="sng" algn="ctr">
-          <a:solidFill>
-            <a:schemeClr val="phClr"/>
-          </a:solidFill>
           <a:prstDash val="solid"/>
           <a:miter lim="800000"/>
         </a:ln>
         <a:ln w="12700" cap="flat" cmpd="sng" algn="ctr">
-          <a:solidFill>
-            <a:schemeClr val="phClr"/>
-          </a:solidFill>
           <a:prstDash val="solid"/>
           <a:miter lim="800000"/>
         </a:ln>
         <a:ln w="19050" cap="flat" cmpd="sng" algn="ctr">
-          <a:solidFill>
-            <a:schemeClr val="phClr"/>
-          </a:solidFill>
           <a:prstDash val="solid"/>
           <a:miter lim="800000"/>
         </a:ln>
@@ -4013,13 +3677,7 @@
           <a:effectLst/>
         </a:effectStyle>
         <a:effectStyle>
-          <a:effectLst>
-            <a:outerShdw blurRad="57150" dist="19050" dir="5400000" algn="ctr" rotWithShape="0">
-              <a:srgbClr val="000000">
-                <a:alpha val="63000"/>
-              </a:srgbClr>
-            </a:outerShdw>
-          </a:effectLst>
+          <a:effectLst/>
         </a:effectStyle>
       </a:effectStyleLst>
       <a:bgFillStyleLst>
@@ -4029,15 +3687,13 @@
         <a:solidFill>
           <a:schemeClr val="phClr">
             <a:tint val="95000"/>
-            <a:satMod val="170000"/>
           </a:schemeClr>
         </a:solidFill>
-        <a:gradFill rotWithShape="1">
+        <a:gradFill>
           <a:gsLst>
             <a:gs pos="0">
               <a:schemeClr val="phClr">
                 <a:tint val="93000"/>
-                <a:satMod val="150000"/>
                 <a:shade val="98000"/>
                 <a:lumMod val="102000"/>
               </a:schemeClr>
@@ -4045,7 +3701,6 @@
             <a:gs pos="50000">
               <a:schemeClr val="phClr">
                 <a:tint val="98000"/>
-                <a:satMod val="130000"/>
                 <a:shade val="90000"/>
                 <a:lumMod val="103000"/>
               </a:schemeClr>
@@ -4053,26 +3708,25 @@
             <a:gs pos="100000">
               <a:schemeClr val="phClr">
                 <a:shade val="63000"/>
-                <a:satMod val="120000"/>
               </a:schemeClr>
             </a:gs>
           </a:gsLst>
           <a:lin ang="5400000" scaled="0"/>
+          <a:tileRect/>
         </a:gradFill>
       </a:bgFillStyleLst>
     </a:fmtScheme>
   </a:themeElements>
   <a:objectDefaults/>
   <a:extraClrSchemeLst/>
-  <a:extLst>
-    <a:ext uri="{05A4C25C-085E-4340-85A3-A5531E510DB2}">
-      <thm15:themeFamily xmlns:thm15="http://schemas.microsoft.com/office/thememl/2012/main" name="Office Theme" id="{62F939B6-93AF-4DB8-9C6B-D6C7DFDC589F}" vid="{4A3C46E8-61CC-4603-A589-7422A47A8E4A}"/>
-    </a:ext>
-  </a:extLst>
 </a:theme>
 </file>
 
 <file path=customXml/item1.xml><?xml version="1.0" encoding="utf-8"?>
+<b:Sources xmlns:b="http://schemas.openxmlformats.org/officeDocument/2006/bibliography" xmlns="http://schemas.openxmlformats.org/officeDocument/2006/bibliography" SelectedStyle="\APASixthEditionOfficeOnline.xsl" StyleName="APA" Version="6"/>
+</file>
+
+<file path=customXml/item2.xml><?xml version="1.0" encoding="utf-8"?>
 <?mso-contentType ?>
 <FormTemplates xmlns="http://schemas.microsoft.com/sharepoint/v3/contenttype/forms">
   <Display>DocumentLibraryForm</Display>
@@ -4081,13 +3735,13 @@
 </FormTemplates>
 </file>
 
-<file path=customXml/item2.xml><?xml version="1.0" encoding="utf-8"?>
+<file path=customXml/item3.xml><?xml version="1.0" encoding="utf-8"?>
 <p:properties xmlns:p="http://schemas.microsoft.com/office/2006/metadata/properties" xmlns:xsi="http://www.w3.org/2001/XMLSchema-instance" xmlns:pc="http://schemas.microsoft.com/office/infopath/2007/PartnerControls">
   <documentManagement/>
 </p:properties>
 </file>
 
-<file path=customXml/item3.xml><?xml version="1.0" encoding="utf-8"?>
+<file path=customXml/item4.xml><?xml version="1.0" encoding="utf-8"?>
 <ct:contentTypeSchema xmlns:ct="http://schemas.microsoft.com/office/2006/metadata/contentType" xmlns:ma="http://schemas.microsoft.com/office/2006/metadata/properties/metaAttributes" ct:_="" ma:_="" ma:contentTypeName="Document" ma:contentTypeID="0x01010051139B3880321046AE87D26DA4CC94D4" ma:contentTypeVersion="13" ma:contentTypeDescription="Create a new document." ma:contentTypeScope="" ma:versionID="ba8c65f602d47d280d1e49cff8615b65">
   <xsd:schema xmlns:xsd="http://www.w3.org/2001/XMLSchema" xmlns:xs="http://www.w3.org/2001/XMLSchema" xmlns:p="http://schemas.microsoft.com/office/2006/metadata/properties" xmlns:ns3="dd637ece-cf3b-4b0c-a105-68560928b251" xmlns:ns4="5909b1e2-580a-4ca8-9a84-8e97307d354c" targetNamespace="http://schemas.microsoft.com/office/2006/metadata/properties" ma:root="true" ma:fieldsID="949bb4e466a567ed83d92182055bb294" ns3:_="" ns4:_="">
     <xsd:import namespace="dd637ece-cf3b-4b0c-a105-68560928b251"/>
@@ -4310,11 +3964,15 @@
 </ct:contentTypeSchema>
 </file>
 
-<file path=customXml/item4.xml><?xml version="1.0" encoding="utf-8"?>
-<b:Sources xmlns:b="http://schemas.openxmlformats.org/officeDocument/2006/bibliography" xmlns="http://schemas.openxmlformats.org/officeDocument/2006/bibliography" SelectedStyle="\APASixthEditionOfficeOnline.xsl" StyleName="APA" Version="6"/>
+<file path=customXml/itemProps1.xml><?xml version="1.0" encoding="utf-8"?>
+<ds:datastoreItem xmlns:ds="http://schemas.openxmlformats.org/officeDocument/2006/customXml" ds:itemID="{8E60E12E-11DC-4913-9CE2-1B60D3D416C1}">
+  <ds:schemaRefs>
+    <ds:schemaRef ds:uri="http://schemas.openxmlformats.org/officeDocument/2006/bibliography"/>
+  </ds:schemaRefs>
+</ds:datastoreItem>
 </file>
 
-<file path=customXml/itemProps1.xml><?xml version="1.0" encoding="utf-8"?>
+<file path=customXml/itemProps2.xml><?xml version="1.0" encoding="utf-8"?>
 <ds:datastoreItem xmlns:ds="http://schemas.openxmlformats.org/officeDocument/2006/customXml" ds:itemID="{88BE3AA8-91E5-4C89-825D-FF9B0DE69F51}">
   <ds:schemaRefs>
     <ds:schemaRef ds:uri="http://schemas.microsoft.com/sharepoint/v3/contenttype/forms"/>
@@ -4322,7 +3980,7 @@
 </ds:datastoreItem>
 </file>
 
-<file path=customXml/itemProps2.xml><?xml version="1.0" encoding="utf-8"?>
+<file path=customXml/itemProps3.xml><?xml version="1.0" encoding="utf-8"?>
 <ds:datastoreItem xmlns:ds="http://schemas.openxmlformats.org/officeDocument/2006/customXml" ds:itemID="{B815AC04-6775-46B6-A076-7D48BAD2AFD0}">
   <ds:schemaRefs>
     <ds:schemaRef ds:uri="http://schemas.microsoft.com/office/2006/metadata/properties"/>
@@ -4331,7 +3989,7 @@
 </ds:datastoreItem>
 </file>
 
-<file path=customXml/itemProps3.xml><?xml version="1.0" encoding="utf-8"?>
+<file path=customXml/itemProps4.xml><?xml version="1.0" encoding="utf-8"?>
 <ds:datastoreItem xmlns:ds="http://schemas.openxmlformats.org/officeDocument/2006/customXml" ds:itemID="{E19FE24E-FD46-46FA-93E5-6E5A875F17A1}">
   <ds:schemaRefs>
     <ds:schemaRef ds:uri="http://schemas.microsoft.com/office/2006/metadata/contentType"/>
@@ -4348,12 +4006,4 @@
     <ds:schemaRef ds:uri="http://schemas.microsoft.com/internal/obd"/>
   </ds:schemaRefs>
 </ds:datastoreItem>
-</file>
-
-<file path=customXml/itemProps4.xml><?xml version="1.0" encoding="utf-8"?>
-<ds:datastoreItem xmlns:ds="http://schemas.openxmlformats.org/officeDocument/2006/customXml" ds:itemID="{8E60E12E-11DC-4913-9CE2-1B60D3D416C1}">
-  <ds:schemaRefs>
-    <ds:schemaRef ds:uri="http://schemas.openxmlformats.org/officeDocument/2006/bibliography"/>
-  </ds:schemaRefs>
-</ds:datastoreItem>
 </file>
</xml_diff>